<commit_message>
updated the docx file
</commit_message>
<xml_diff>
--- a/ipynb_file_cell_explaination.docx
+++ b/ipynb_file_cell_explaination.docx
@@ -15990,20 +15990,7 @@
           <w:lang w:eastAsia="en-IN"/>
           <w14:ligatures w14:val="none"/>
         </w:rPr>
-        <w:t xml:space="preserve">Step 9: </w:t>
-      </w:r>
-      <w:r>
-        <w:rPr>
-          <w:rFonts w:ascii="Times New Roman" w:eastAsia="Times New Roman" w:hAnsi="Times New Roman" w:cs="Times New Roman"/>
-          <w:b/>
-          <w:bCs/>
-          <w:kern w:val="0"/>
-          <w:sz w:val="28"/>
-          <w:szCs w:val="28"/>
-          <w:lang w:eastAsia="en-IN"/>
-          <w14:ligatures w14:val="none"/>
-        </w:rPr>
-        <w:t>SARIMA Computational Failure Note (Step 8)</w:t>
+        <w:t>Step 9: SARIMA Computational Failure Note (Step 8)</w:t>
       </w:r>
     </w:p>
     <w:p>
@@ -17662,6 +17649,2806 @@
           <w14:ligatures w14:val="none"/>
         </w:rPr>
       </w:pPr>
+    </w:p>
+    <w:p>
+      <w:pPr>
+        <w:spacing w:before="100" w:beforeAutospacing="1" w:after="100" w:afterAutospacing="1" w:line="240" w:lineRule="auto"/>
+        <w:rPr>
+          <w:rFonts w:ascii="Times New Roman" w:eastAsia="Times New Roman" w:hAnsi="Times New Roman" w:cs="Times New Roman"/>
+          <w:kern w:val="0"/>
+          <w:sz w:val="24"/>
+          <w:szCs w:val="24"/>
+          <w:lang w:eastAsia="en-IN"/>
+          <w14:ligatures w14:val="none"/>
+        </w:rPr>
+      </w:pPr>
+    </w:p>
+    <w:p>
+      <w:pPr>
+        <w:spacing w:before="100" w:beforeAutospacing="1" w:after="100" w:afterAutospacing="1" w:line="240" w:lineRule="auto"/>
+        <w:rPr>
+          <w:rFonts w:ascii="Times New Roman" w:eastAsia="Times New Roman" w:hAnsi="Times New Roman" w:cs="Times New Roman"/>
+          <w:kern w:val="0"/>
+          <w:sz w:val="24"/>
+          <w:szCs w:val="24"/>
+          <w:lang w:eastAsia="en-IN"/>
+          <w14:ligatures w14:val="none"/>
+        </w:rPr>
+      </w:pPr>
+    </w:p>
+    <w:p>
+      <w:pPr>
+        <w:spacing w:before="100" w:beforeAutospacing="1" w:after="100" w:afterAutospacing="1" w:line="240" w:lineRule="auto"/>
+        <w:rPr>
+          <w:rFonts w:ascii="Times New Roman" w:eastAsia="Times New Roman" w:hAnsi="Times New Roman" w:cs="Times New Roman"/>
+          <w:kern w:val="0"/>
+          <w:sz w:val="24"/>
+          <w:szCs w:val="24"/>
+          <w:lang w:eastAsia="en-IN"/>
+          <w14:ligatures w14:val="none"/>
+        </w:rPr>
+      </w:pPr>
+    </w:p>
+    <w:p>
+      <w:pPr>
+        <w:spacing w:before="100" w:beforeAutospacing="1" w:after="100" w:afterAutospacing="1" w:line="240" w:lineRule="auto"/>
+        <w:rPr>
+          <w:rFonts w:ascii="Times New Roman" w:eastAsia="Times New Roman" w:hAnsi="Times New Roman" w:cs="Times New Roman"/>
+          <w:kern w:val="0"/>
+          <w:sz w:val="24"/>
+          <w:szCs w:val="24"/>
+          <w:lang w:eastAsia="en-IN"/>
+          <w14:ligatures w14:val="none"/>
+        </w:rPr>
+      </w:pPr>
+    </w:p>
+    <w:p>
+      <w:pPr>
+        <w:spacing w:before="100" w:beforeAutospacing="1" w:after="100" w:afterAutospacing="1" w:line="240" w:lineRule="auto"/>
+        <w:rPr>
+          <w:rFonts w:ascii="Times New Roman" w:eastAsia="Times New Roman" w:hAnsi="Times New Roman" w:cs="Times New Roman"/>
+          <w:kern w:val="0"/>
+          <w:sz w:val="24"/>
+          <w:szCs w:val="24"/>
+          <w:lang w:eastAsia="en-IN"/>
+          <w14:ligatures w14:val="none"/>
+        </w:rPr>
+      </w:pPr>
+    </w:p>
+    <w:p>
+      <w:pPr>
+        <w:spacing w:before="100" w:beforeAutospacing="1" w:after="100" w:afterAutospacing="1" w:line="240" w:lineRule="auto"/>
+        <w:rPr>
+          <w:rFonts w:ascii="Times New Roman" w:eastAsia="Times New Roman" w:hAnsi="Times New Roman" w:cs="Times New Roman"/>
+          <w:b/>
+          <w:bCs/>
+          <w:kern w:val="0"/>
+          <w:sz w:val="28"/>
+          <w:szCs w:val="28"/>
+          <w:lang w:eastAsia="en-IN"/>
+          <w14:ligatures w14:val="none"/>
+        </w:rPr>
+      </w:pPr>
+      <w:r>
+        <w:rPr>
+          <w:rFonts w:ascii="Times New Roman" w:eastAsia="Times New Roman" w:hAnsi="Times New Roman" w:cs="Times New Roman"/>
+          <w:b/>
+          <w:bCs/>
+          <w:kern w:val="0"/>
+          <w:sz w:val="28"/>
+          <w:szCs w:val="28"/>
+          <w:lang w:eastAsia="en-IN"/>
+          <w14:ligatures w14:val="none"/>
+        </w:rPr>
+        <w:lastRenderedPageBreak/>
+        <w:t>Step 12: STL + 1D-CNN Training (The Deep Learning Benchmark)</w:t>
+      </w:r>
+    </w:p>
+    <w:p>
+      <w:pPr>
+        <w:spacing w:before="100" w:beforeAutospacing="1" w:after="100" w:afterAutospacing="1" w:line="240" w:lineRule="auto"/>
+        <w:rPr>
+          <w:rFonts w:ascii="Times New Roman" w:eastAsia="Times New Roman" w:hAnsi="Times New Roman" w:cs="Times New Roman"/>
+          <w:kern w:val="0"/>
+          <w:sz w:val="24"/>
+          <w:szCs w:val="24"/>
+          <w:lang w:eastAsia="en-IN"/>
+          <w14:ligatures w14:val="none"/>
+        </w:rPr>
+      </w:pPr>
+      <w:r>
+        <w:rPr>
+          <w:rFonts w:ascii="Times New Roman" w:eastAsia="Times New Roman" w:hAnsi="Times New Roman" w:cs="Times New Roman"/>
+          <w:kern w:val="0"/>
+          <w:sz w:val="24"/>
+          <w:szCs w:val="24"/>
+          <w:lang w:eastAsia="en-IN"/>
+          <w14:ligatures w14:val="none"/>
+        </w:rPr>
+        <w:t xml:space="preserve">The goal of this step was to implement the final proposed model, a </w:t>
+      </w:r>
+      <w:r>
+        <w:rPr>
+          <w:rFonts w:ascii="Times New Roman" w:eastAsia="Times New Roman" w:hAnsi="Times New Roman" w:cs="Times New Roman"/>
+          <w:b/>
+          <w:bCs/>
+          <w:kern w:val="0"/>
+          <w:sz w:val="24"/>
+          <w:szCs w:val="24"/>
+          <w:lang w:eastAsia="en-IN"/>
+          <w14:ligatures w14:val="none"/>
+        </w:rPr>
+        <w:t>One-Dimensional Convolutional Neural Network (1D-CNN)</w:t>
+      </w:r>
+      <w:r>
+        <w:rPr>
+          <w:rFonts w:ascii="Times New Roman" w:eastAsia="Times New Roman" w:hAnsi="Times New Roman" w:cs="Times New Roman"/>
+          <w:kern w:val="0"/>
+          <w:sz w:val="24"/>
+          <w:szCs w:val="24"/>
+          <w:lang w:eastAsia="en-IN"/>
+          <w14:ligatures w14:val="none"/>
+        </w:rPr>
+        <w:t xml:space="preserve">, within the hybrid framework to assess the performance of Deep Learning on the residual forecasting task. This required resolving significant GPU dependency issues via a clean </w:t>
+      </w:r>
+      <w:r>
+        <w:rPr>
+          <w:rFonts w:ascii="Times New Roman" w:eastAsia="Times New Roman" w:hAnsi="Times New Roman" w:cs="Times New Roman"/>
+          <w:b/>
+          <w:bCs/>
+          <w:kern w:val="0"/>
+          <w:sz w:val="24"/>
+          <w:szCs w:val="24"/>
+          <w:lang w:eastAsia="en-IN"/>
+          <w14:ligatures w14:val="none"/>
+        </w:rPr>
+        <w:t>WSL2/Ubuntu</w:t>
+      </w:r>
+      <w:r>
+        <w:rPr>
+          <w:rFonts w:ascii="Times New Roman" w:eastAsia="Times New Roman" w:hAnsi="Times New Roman" w:cs="Times New Roman"/>
+          <w:kern w:val="0"/>
+          <w:sz w:val="24"/>
+          <w:szCs w:val="24"/>
+          <w:lang w:eastAsia="en-IN"/>
+          <w14:ligatures w14:val="none"/>
+        </w:rPr>
+        <w:t xml:space="preserve"> environment.</w:t>
+      </w:r>
+    </w:p>
+    <w:p>
+      <w:pPr>
+        <w:spacing w:before="100" w:beforeAutospacing="1" w:after="100" w:afterAutospacing="1" w:line="240" w:lineRule="auto"/>
+        <w:rPr>
+          <w:rFonts w:ascii="Times New Roman" w:eastAsia="Times New Roman" w:hAnsi="Times New Roman" w:cs="Times New Roman"/>
+          <w:b/>
+          <w:bCs/>
+          <w:kern w:val="0"/>
+          <w:sz w:val="24"/>
+          <w:szCs w:val="24"/>
+          <w:lang w:eastAsia="en-IN"/>
+          <w14:ligatures w14:val="none"/>
+        </w:rPr>
+      </w:pPr>
+      <w:r>
+        <w:rPr>
+          <w:rFonts w:ascii="Times New Roman" w:eastAsia="Times New Roman" w:hAnsi="Times New Roman" w:cs="Times New Roman"/>
+          <w:b/>
+          <w:bCs/>
+          <w:kern w:val="0"/>
+          <w:sz w:val="24"/>
+          <w:szCs w:val="24"/>
+          <w:lang w:eastAsia="en-IN"/>
+          <w14:ligatures w14:val="none"/>
+        </w:rPr>
+        <w:t>The Process (What the Code Did)</w:t>
+      </w:r>
+    </w:p>
+    <w:tbl>
+      <w:tblPr>
+        <w:tblW w:w="10490" w:type="dxa"/>
+        <w:tblCellSpacing w:w="15" w:type="dxa"/>
+        <w:tblInd w:w="-714" w:type="dxa"/>
+        <w:tblBorders>
+          <w:top w:val="single" w:sz="4" w:space="0" w:color="auto"/>
+          <w:left w:val="single" w:sz="4" w:space="0" w:color="auto"/>
+          <w:bottom w:val="single" w:sz="4" w:space="0" w:color="auto"/>
+          <w:right w:val="single" w:sz="4" w:space="0" w:color="auto"/>
+          <w:insideH w:val="single" w:sz="4" w:space="0" w:color="auto"/>
+          <w:insideV w:val="single" w:sz="4" w:space="0" w:color="auto"/>
+        </w:tblBorders>
+        <w:tblCellMar>
+          <w:top w:w="15" w:type="dxa"/>
+          <w:left w:w="15" w:type="dxa"/>
+          <w:bottom w:w="15" w:type="dxa"/>
+          <w:right w:w="15" w:type="dxa"/>
+        </w:tblCellMar>
+        <w:tblLook w:val="04A0" w:firstRow="1" w:lastRow="0" w:firstColumn="1" w:lastColumn="0" w:noHBand="0" w:noVBand="1"/>
+      </w:tblPr>
+      <w:tblGrid>
+        <w:gridCol w:w="2552"/>
+        <w:gridCol w:w="2600"/>
+        <w:gridCol w:w="5338"/>
+      </w:tblGrid>
+      <w:tr>
+        <w:trPr>
+          <w:tblHeader/>
+          <w:tblCellSpacing w:w="15" w:type="dxa"/>
+        </w:trPr>
+        <w:tc>
+          <w:tcPr>
+            <w:tcW w:w="2507" w:type="dxa"/>
+            <w:vAlign w:val="center"/>
+            <w:hideMark/>
+          </w:tcPr>
+          <w:p>
+            <w:pPr>
+              <w:spacing w:before="100" w:beforeAutospacing="1" w:after="100" w:afterAutospacing="1" w:line="240" w:lineRule="auto"/>
+              <w:rPr>
+                <w:rFonts w:ascii="Times New Roman" w:eastAsia="Times New Roman" w:hAnsi="Times New Roman" w:cs="Times New Roman"/>
+                <w:kern w:val="0"/>
+                <w:sz w:val="24"/>
+                <w:szCs w:val="24"/>
+                <w:lang w:eastAsia="en-IN"/>
+                <w14:ligatures w14:val="none"/>
+              </w:rPr>
+            </w:pPr>
+            <w:r>
+              <w:rPr>
+                <w:rFonts w:ascii="Times New Roman" w:eastAsia="Times New Roman" w:hAnsi="Times New Roman" w:cs="Times New Roman"/>
+                <w:b/>
+                <w:bCs/>
+                <w:kern w:val="0"/>
+                <w:sz w:val="24"/>
+                <w:szCs w:val="24"/>
+                <w:lang w:eastAsia="en-IN"/>
+                <w14:ligatures w14:val="none"/>
+              </w:rPr>
+              <w:t>Process Action</w:t>
+            </w:r>
+          </w:p>
+        </w:tc>
+        <w:tc>
+          <w:tcPr>
+            <w:tcW w:w="2570" w:type="dxa"/>
+            <w:vAlign w:val="center"/>
+            <w:hideMark/>
+          </w:tcPr>
+          <w:p>
+            <w:pPr>
+              <w:spacing w:before="100" w:beforeAutospacing="1" w:after="100" w:afterAutospacing="1" w:line="240" w:lineRule="auto"/>
+              <w:rPr>
+                <w:rFonts w:ascii="Times New Roman" w:eastAsia="Times New Roman" w:hAnsi="Times New Roman" w:cs="Times New Roman"/>
+                <w:kern w:val="0"/>
+                <w:sz w:val="24"/>
+                <w:szCs w:val="24"/>
+                <w:lang w:eastAsia="en-IN"/>
+                <w14:ligatures w14:val="none"/>
+              </w:rPr>
+            </w:pPr>
+            <w:r>
+              <w:rPr>
+                <w:rFonts w:ascii="Times New Roman" w:eastAsia="Times New Roman" w:hAnsi="Times New Roman" w:cs="Times New Roman"/>
+                <w:b/>
+                <w:bCs/>
+                <w:kern w:val="0"/>
+                <w:sz w:val="24"/>
+                <w:szCs w:val="24"/>
+                <w:lang w:eastAsia="en-IN"/>
+                <w14:ligatures w14:val="none"/>
+              </w:rPr>
+              <w:t>Layman's Term</w:t>
+            </w:r>
+          </w:p>
+        </w:tc>
+        <w:tc>
+          <w:tcPr>
+            <w:tcW w:w="5293" w:type="dxa"/>
+            <w:vAlign w:val="center"/>
+            <w:hideMark/>
+          </w:tcPr>
+          <w:p>
+            <w:pPr>
+              <w:spacing w:before="100" w:beforeAutospacing="1" w:after="100" w:afterAutospacing="1" w:line="240" w:lineRule="auto"/>
+              <w:rPr>
+                <w:rFonts w:ascii="Times New Roman" w:eastAsia="Times New Roman" w:hAnsi="Times New Roman" w:cs="Times New Roman"/>
+                <w:kern w:val="0"/>
+                <w:sz w:val="24"/>
+                <w:szCs w:val="24"/>
+                <w:lang w:eastAsia="en-IN"/>
+                <w14:ligatures w14:val="none"/>
+              </w:rPr>
+            </w:pPr>
+            <w:r>
+              <w:rPr>
+                <w:rFonts w:ascii="Times New Roman" w:eastAsia="Times New Roman" w:hAnsi="Times New Roman" w:cs="Times New Roman"/>
+                <w:b/>
+                <w:bCs/>
+                <w:kern w:val="0"/>
+                <w:sz w:val="24"/>
+                <w:szCs w:val="24"/>
+                <w:lang w:eastAsia="en-IN"/>
+                <w14:ligatures w14:val="none"/>
+              </w:rPr>
+              <w:t>Technical Role</w:t>
+            </w:r>
+          </w:p>
+        </w:tc>
+      </w:tr>
+      <w:tr>
+        <w:trPr>
+          <w:tblCellSpacing w:w="15" w:type="dxa"/>
+        </w:trPr>
+        <w:tc>
+          <w:tcPr>
+            <w:tcW w:w="2507" w:type="dxa"/>
+            <w:vAlign w:val="center"/>
+            <w:hideMark/>
+          </w:tcPr>
+          <w:p>
+            <w:pPr>
+              <w:spacing w:before="100" w:beforeAutospacing="1" w:after="100" w:afterAutospacing="1" w:line="240" w:lineRule="auto"/>
+              <w:rPr>
+                <w:rFonts w:ascii="Times New Roman" w:eastAsia="Times New Roman" w:hAnsi="Times New Roman" w:cs="Times New Roman"/>
+                <w:kern w:val="0"/>
+                <w:sz w:val="24"/>
+                <w:szCs w:val="24"/>
+                <w:lang w:eastAsia="en-IN"/>
+                <w14:ligatures w14:val="none"/>
+              </w:rPr>
+            </w:pPr>
+            <w:r>
+              <w:rPr>
+                <w:rFonts w:ascii="Times New Roman" w:eastAsia="Times New Roman" w:hAnsi="Times New Roman" w:cs="Times New Roman"/>
+                <w:b/>
+                <w:bCs/>
+                <w:kern w:val="0"/>
+                <w:sz w:val="24"/>
+                <w:szCs w:val="24"/>
+                <w:lang w:eastAsia="en-IN"/>
+                <w14:ligatures w14:val="none"/>
+              </w:rPr>
+              <w:t>GPU Environment</w:t>
+            </w:r>
+          </w:p>
+        </w:tc>
+        <w:tc>
+          <w:tcPr>
+            <w:tcW w:w="2570" w:type="dxa"/>
+            <w:vAlign w:val="center"/>
+            <w:hideMark/>
+          </w:tcPr>
+          <w:p>
+            <w:pPr>
+              <w:spacing w:before="100" w:beforeAutospacing="1" w:after="100" w:afterAutospacing="1" w:line="240" w:lineRule="auto"/>
+              <w:rPr>
+                <w:rFonts w:ascii="Times New Roman" w:eastAsia="Times New Roman" w:hAnsi="Times New Roman" w:cs="Times New Roman"/>
+                <w:kern w:val="0"/>
+                <w:sz w:val="24"/>
+                <w:szCs w:val="24"/>
+                <w:lang w:eastAsia="en-IN"/>
+                <w14:ligatures w14:val="none"/>
+              </w:rPr>
+            </w:pPr>
+            <w:r>
+              <w:rPr>
+                <w:rFonts w:ascii="Times New Roman" w:eastAsia="Times New Roman" w:hAnsi="Times New Roman" w:cs="Times New Roman"/>
+                <w:b/>
+                <w:bCs/>
+                <w:kern w:val="0"/>
+                <w:sz w:val="24"/>
+                <w:szCs w:val="24"/>
+                <w:lang w:eastAsia="en-IN"/>
+                <w14:ligatures w14:val="none"/>
+              </w:rPr>
+              <w:t>The Clean Room Setup.</w:t>
+            </w:r>
+          </w:p>
+        </w:tc>
+        <w:tc>
+          <w:tcPr>
+            <w:tcW w:w="5293" w:type="dxa"/>
+            <w:vAlign w:val="center"/>
+            <w:hideMark/>
+          </w:tcPr>
+          <w:p>
+            <w:pPr>
+              <w:spacing w:before="100" w:beforeAutospacing="1" w:after="100" w:afterAutospacing="1" w:line="240" w:lineRule="auto"/>
+              <w:rPr>
+                <w:rFonts w:ascii="Times New Roman" w:eastAsia="Times New Roman" w:hAnsi="Times New Roman" w:cs="Times New Roman"/>
+                <w:kern w:val="0"/>
+                <w:sz w:val="24"/>
+                <w:szCs w:val="24"/>
+                <w:lang w:eastAsia="en-IN"/>
+                <w14:ligatures w14:val="none"/>
+              </w:rPr>
+            </w:pPr>
+            <w:r>
+              <w:rPr>
+                <w:rFonts w:ascii="Times New Roman" w:eastAsia="Times New Roman" w:hAnsi="Times New Roman" w:cs="Times New Roman"/>
+                <w:kern w:val="0"/>
+                <w:sz w:val="24"/>
+                <w:szCs w:val="24"/>
+                <w:lang w:eastAsia="en-IN"/>
+                <w14:ligatures w14:val="none"/>
+              </w:rPr>
+              <w:t>Execution within the isolated Conda environment on WSL2 guaranteed access to the NVIDIA RTX 3050 GPU, bypassing Windows conflicts.</w:t>
+            </w:r>
+          </w:p>
+        </w:tc>
+      </w:tr>
+      <w:tr>
+        <w:trPr>
+          <w:tblCellSpacing w:w="15" w:type="dxa"/>
+        </w:trPr>
+        <w:tc>
+          <w:tcPr>
+            <w:tcW w:w="2507" w:type="dxa"/>
+            <w:vAlign w:val="center"/>
+            <w:hideMark/>
+          </w:tcPr>
+          <w:p>
+            <w:pPr>
+              <w:spacing w:before="100" w:beforeAutospacing="1" w:after="100" w:afterAutospacing="1" w:line="240" w:lineRule="auto"/>
+              <w:rPr>
+                <w:rFonts w:ascii="Times New Roman" w:eastAsia="Times New Roman" w:hAnsi="Times New Roman" w:cs="Times New Roman"/>
+                <w:kern w:val="0"/>
+                <w:sz w:val="24"/>
+                <w:szCs w:val="24"/>
+                <w:lang w:eastAsia="en-IN"/>
+                <w14:ligatures w14:val="none"/>
+              </w:rPr>
+            </w:pPr>
+            <w:r>
+              <w:rPr>
+                <w:rFonts w:ascii="Times New Roman" w:eastAsia="Times New Roman" w:hAnsi="Times New Roman" w:cs="Times New Roman"/>
+                <w:b/>
+                <w:bCs/>
+                <w:kern w:val="0"/>
+                <w:sz w:val="24"/>
+                <w:szCs w:val="24"/>
+                <w:lang w:eastAsia="en-IN"/>
+                <w14:ligatures w14:val="none"/>
+              </w:rPr>
+              <w:t>Introduce the Model</w:t>
+            </w:r>
+          </w:p>
+        </w:tc>
+        <w:tc>
+          <w:tcPr>
+            <w:tcW w:w="2570" w:type="dxa"/>
+            <w:vAlign w:val="center"/>
+            <w:hideMark/>
+          </w:tcPr>
+          <w:p>
+            <w:pPr>
+              <w:spacing w:before="100" w:beforeAutospacing="1" w:after="100" w:afterAutospacing="1" w:line="240" w:lineRule="auto"/>
+              <w:rPr>
+                <w:rFonts w:ascii="Times New Roman" w:eastAsia="Times New Roman" w:hAnsi="Times New Roman" w:cs="Times New Roman"/>
+                <w:kern w:val="0"/>
+                <w:sz w:val="24"/>
+                <w:szCs w:val="24"/>
+                <w:lang w:eastAsia="en-IN"/>
+                <w14:ligatures w14:val="none"/>
+              </w:rPr>
+            </w:pPr>
+            <w:r>
+              <w:rPr>
+                <w:rFonts w:ascii="Times New Roman" w:eastAsia="Times New Roman" w:hAnsi="Times New Roman" w:cs="Times New Roman"/>
+                <w:kern w:val="0"/>
+                <w:sz w:val="24"/>
+                <w:szCs w:val="24"/>
+                <w:lang w:eastAsia="en-IN"/>
+                <w14:ligatures w14:val="none"/>
+              </w:rPr>
+              <w:t xml:space="preserve">We chose a </w:t>
+            </w:r>
+            <w:r>
+              <w:rPr>
+                <w:rFonts w:ascii="Times New Roman" w:eastAsia="Times New Roman" w:hAnsi="Times New Roman" w:cs="Times New Roman"/>
+                <w:b/>
+                <w:bCs/>
+                <w:kern w:val="0"/>
+                <w:sz w:val="24"/>
+                <w:szCs w:val="24"/>
+                <w:lang w:eastAsia="en-IN"/>
+                <w14:ligatures w14:val="none"/>
+              </w:rPr>
+              <w:t>1D-CNN</w:t>
+            </w:r>
+            <w:r>
+              <w:rPr>
+                <w:rFonts w:ascii="Times New Roman" w:eastAsia="Times New Roman" w:hAnsi="Times New Roman" w:cs="Times New Roman"/>
+                <w:kern w:val="0"/>
+                <w:sz w:val="24"/>
+                <w:szCs w:val="24"/>
+                <w:lang w:eastAsia="en-IN"/>
+                <w14:ligatures w14:val="none"/>
+              </w:rPr>
+              <w:t>.</w:t>
+            </w:r>
+          </w:p>
+        </w:tc>
+        <w:tc>
+          <w:tcPr>
+            <w:tcW w:w="5293" w:type="dxa"/>
+            <w:vAlign w:val="center"/>
+            <w:hideMark/>
+          </w:tcPr>
+          <w:p>
+            <w:pPr>
+              <w:spacing w:before="100" w:beforeAutospacing="1" w:after="100" w:afterAutospacing="1" w:line="240" w:lineRule="auto"/>
+              <w:rPr>
+                <w:rFonts w:ascii="Times New Roman" w:eastAsia="Times New Roman" w:hAnsi="Times New Roman" w:cs="Times New Roman"/>
+                <w:kern w:val="0"/>
+                <w:sz w:val="24"/>
+                <w:szCs w:val="24"/>
+                <w:lang w:eastAsia="en-IN"/>
+                <w14:ligatures w14:val="none"/>
+              </w:rPr>
+            </w:pPr>
+            <w:r>
+              <w:rPr>
+                <w:rFonts w:ascii="Times New Roman" w:eastAsia="Times New Roman" w:hAnsi="Times New Roman" w:cs="Times New Roman"/>
+                <w:kern w:val="0"/>
+                <w:sz w:val="24"/>
+                <w:szCs w:val="24"/>
+                <w:lang w:eastAsia="en-IN"/>
+                <w14:ligatures w14:val="none"/>
+              </w:rPr>
+              <w:t>This Deep Learning architecture is specifically designed to automatically learn patterns (features) from sequential data like time series.</w:t>
+            </w:r>
+          </w:p>
+        </w:tc>
+      </w:tr>
+      <w:tr>
+        <w:trPr>
+          <w:tblCellSpacing w:w="15" w:type="dxa"/>
+        </w:trPr>
+        <w:tc>
+          <w:tcPr>
+            <w:tcW w:w="2507" w:type="dxa"/>
+            <w:vAlign w:val="center"/>
+            <w:hideMark/>
+          </w:tcPr>
+          <w:p>
+            <w:pPr>
+              <w:spacing w:before="100" w:beforeAutospacing="1" w:after="100" w:afterAutospacing="1" w:line="240" w:lineRule="auto"/>
+              <w:rPr>
+                <w:rFonts w:ascii="Times New Roman" w:eastAsia="Times New Roman" w:hAnsi="Times New Roman" w:cs="Times New Roman"/>
+                <w:kern w:val="0"/>
+                <w:sz w:val="24"/>
+                <w:szCs w:val="24"/>
+                <w:lang w:eastAsia="en-IN"/>
+                <w14:ligatures w14:val="none"/>
+              </w:rPr>
+            </w:pPr>
+            <w:r>
+              <w:rPr>
+                <w:rFonts w:ascii="Times New Roman" w:eastAsia="Times New Roman" w:hAnsi="Times New Roman" w:cs="Times New Roman"/>
+                <w:b/>
+                <w:bCs/>
+                <w:kern w:val="0"/>
+                <w:sz w:val="24"/>
+                <w:szCs w:val="24"/>
+                <w:lang w:eastAsia="en-IN"/>
+                <w14:ligatures w14:val="none"/>
+              </w:rPr>
+              <w:t>Training Command</w:t>
+            </w:r>
+          </w:p>
+        </w:tc>
+        <w:tc>
+          <w:tcPr>
+            <w:tcW w:w="2570" w:type="dxa"/>
+            <w:vAlign w:val="center"/>
+            <w:hideMark/>
+          </w:tcPr>
+          <w:p>
+            <w:pPr>
+              <w:spacing w:before="100" w:beforeAutospacing="1" w:after="100" w:afterAutospacing="1" w:line="240" w:lineRule="auto"/>
+              <w:rPr>
+                <w:rFonts w:ascii="Times New Roman" w:eastAsia="Times New Roman" w:hAnsi="Times New Roman" w:cs="Times New Roman"/>
+                <w:kern w:val="0"/>
+                <w:sz w:val="24"/>
+                <w:szCs w:val="24"/>
+                <w:lang w:eastAsia="en-IN"/>
+                <w14:ligatures w14:val="none"/>
+              </w:rPr>
+            </w:pPr>
+            <w:r>
+              <w:rPr>
+                <w:rFonts w:ascii="Times New Roman" w:eastAsia="Times New Roman" w:hAnsi="Times New Roman" w:cs="Times New Roman"/>
+                <w:kern w:val="0"/>
+                <w:sz w:val="24"/>
+                <w:szCs w:val="24"/>
+                <w:lang w:eastAsia="en-IN"/>
+                <w14:ligatures w14:val="none"/>
+              </w:rPr>
+              <w:t xml:space="preserve">The </w:t>
+            </w:r>
+            <w:proofErr w:type="spellStart"/>
+            <w:proofErr w:type="gramStart"/>
+            <w:r>
+              <w:rPr>
+                <w:rFonts w:ascii="Times New Roman" w:eastAsia="Times New Roman" w:hAnsi="Times New Roman" w:cs="Times New Roman"/>
+                <w:kern w:val="0"/>
+                <w:sz w:val="24"/>
+                <w:szCs w:val="24"/>
+                <w:lang w:eastAsia="en-IN"/>
+                <w14:ligatures w14:val="none"/>
+              </w:rPr>
+              <w:t>cnn_model.fit</w:t>
+            </w:r>
+            <w:proofErr w:type="spellEnd"/>
+            <w:r>
+              <w:rPr>
+                <w:rFonts w:ascii="Times New Roman" w:eastAsia="Times New Roman" w:hAnsi="Times New Roman" w:cs="Times New Roman"/>
+                <w:kern w:val="0"/>
+                <w:sz w:val="24"/>
+                <w:szCs w:val="24"/>
+                <w:lang w:eastAsia="en-IN"/>
+                <w14:ligatures w14:val="none"/>
+              </w:rPr>
+              <w:t>(</w:t>
+            </w:r>
+            <w:proofErr w:type="gramEnd"/>
+            <w:r>
+              <w:rPr>
+                <w:rFonts w:ascii="Times New Roman" w:eastAsia="Times New Roman" w:hAnsi="Times New Roman" w:cs="Times New Roman"/>
+                <w:kern w:val="0"/>
+                <w:sz w:val="24"/>
+                <w:szCs w:val="24"/>
+                <w:lang w:eastAsia="en-IN"/>
+                <w14:ligatures w14:val="none"/>
+              </w:rPr>
+              <w:t>) command was executed.</w:t>
+            </w:r>
+          </w:p>
+        </w:tc>
+        <w:tc>
+          <w:tcPr>
+            <w:tcW w:w="5293" w:type="dxa"/>
+            <w:vAlign w:val="center"/>
+            <w:hideMark/>
+          </w:tcPr>
+          <w:p>
+            <w:pPr>
+              <w:spacing w:before="100" w:beforeAutospacing="1" w:after="100" w:afterAutospacing="1" w:line="240" w:lineRule="auto"/>
+              <w:rPr>
+                <w:rFonts w:ascii="Times New Roman" w:eastAsia="Times New Roman" w:hAnsi="Times New Roman" w:cs="Times New Roman"/>
+                <w:kern w:val="0"/>
+                <w:sz w:val="24"/>
+                <w:szCs w:val="24"/>
+                <w:lang w:eastAsia="en-IN"/>
+                <w14:ligatures w14:val="none"/>
+              </w:rPr>
+            </w:pPr>
+            <w:r>
+              <w:rPr>
+                <w:rFonts w:ascii="Times New Roman" w:eastAsia="Times New Roman" w:hAnsi="Times New Roman" w:cs="Times New Roman"/>
+                <w:b/>
+                <w:bCs/>
+                <w:kern w:val="0"/>
+                <w:sz w:val="24"/>
+                <w:szCs w:val="24"/>
+                <w:lang w:eastAsia="en-IN"/>
+                <w14:ligatures w14:val="none"/>
+              </w:rPr>
+              <w:t>Training Target:</w:t>
+            </w:r>
+            <w:r>
+              <w:rPr>
+                <w:rFonts w:ascii="Times New Roman" w:eastAsia="Times New Roman" w:hAnsi="Times New Roman" w:cs="Times New Roman"/>
+                <w:kern w:val="0"/>
+                <w:sz w:val="24"/>
+                <w:szCs w:val="24"/>
+                <w:lang w:eastAsia="en-IN"/>
+                <w14:ligatures w14:val="none"/>
+              </w:rPr>
+              <w:t xml:space="preserve"> The model trained using sequences of the </w:t>
+            </w:r>
+            <w:r>
+              <w:rPr>
+                <w:rFonts w:ascii="Times New Roman" w:eastAsia="Times New Roman" w:hAnsi="Times New Roman" w:cs="Times New Roman"/>
+                <w:b/>
+                <w:bCs/>
+                <w:kern w:val="0"/>
+                <w:sz w:val="24"/>
+                <w:szCs w:val="24"/>
+                <w:lang w:eastAsia="en-IN"/>
+                <w14:ligatures w14:val="none"/>
+              </w:rPr>
+              <w:t>scaled Residual</w:t>
+            </w:r>
+            <w:r>
+              <w:rPr>
+                <w:rFonts w:ascii="Times New Roman" w:eastAsia="Times New Roman" w:hAnsi="Times New Roman" w:cs="Times New Roman"/>
+                <w:kern w:val="0"/>
+                <w:sz w:val="24"/>
+                <w:szCs w:val="24"/>
+                <w:lang w:eastAsia="en-IN"/>
+                <w14:ligatures w14:val="none"/>
+              </w:rPr>
+              <w:t xml:space="preserve"> (</w:t>
+            </w:r>
+            <w:proofErr w:type="spellStart"/>
+            <w:r>
+              <w:rPr>
+                <w:rFonts w:ascii="Times New Roman" w:eastAsia="Times New Roman" w:hAnsi="Times New Roman" w:cs="Times New Roman"/>
+                <w:b/>
+                <w:bCs/>
+                <w:kern w:val="0"/>
+                <w:sz w:val="24"/>
+                <w:szCs w:val="24"/>
+                <w:lang w:eastAsia="en-IN"/>
+                <w14:ligatures w14:val="none"/>
+              </w:rPr>
+              <w:t>X</w:t>
+            </w:r>
+            <w:r>
+              <w:rPr>
+                <w:rFonts w:ascii="Times New Roman" w:eastAsia="Times New Roman" w:hAnsi="Times New Roman" w:cs="Times New Roman"/>
+                <w:b/>
+                <w:bCs/>
+                <w:kern w:val="0"/>
+                <w:sz w:val="24"/>
+                <w:szCs w:val="24"/>
+                <w:vertAlign w:val="subscript"/>
+                <w:lang w:eastAsia="en-IN"/>
+                <w14:ligatures w14:val="none"/>
+              </w:rPr>
+              <w:t>train_seq</w:t>
+            </w:r>
+            <w:proofErr w:type="spellEnd"/>
+            <w:r>
+              <w:rPr>
+                <w:rFonts w:ascii="Times New Roman" w:eastAsia="Times New Roman" w:hAnsi="Times New Roman" w:cs="Times New Roman"/>
+                <w:kern w:val="0"/>
+                <w:sz w:val="24"/>
+                <w:szCs w:val="24"/>
+                <w:lang w:eastAsia="en-IN"/>
+                <w14:ligatures w14:val="none"/>
+              </w:rPr>
+              <w:t xml:space="preserve">) to predict the next </w:t>
+            </w:r>
+            <w:r>
+              <w:rPr>
+                <w:rFonts w:ascii="Times New Roman" w:eastAsia="Times New Roman" w:hAnsi="Times New Roman" w:cs="Times New Roman"/>
+                <w:b/>
+                <w:bCs/>
+                <w:kern w:val="0"/>
+                <w:sz w:val="24"/>
+                <w:szCs w:val="24"/>
+                <w:lang w:eastAsia="en-IN"/>
+                <w14:ligatures w14:val="none"/>
+              </w:rPr>
+              <w:t>scaled Residual</w:t>
+            </w:r>
+            <w:r>
+              <w:rPr>
+                <w:rFonts w:ascii="Times New Roman" w:eastAsia="Times New Roman" w:hAnsi="Times New Roman" w:cs="Times New Roman"/>
+                <w:kern w:val="0"/>
+                <w:sz w:val="24"/>
+                <w:szCs w:val="24"/>
+                <w:lang w:eastAsia="en-IN"/>
+                <w14:ligatures w14:val="none"/>
+              </w:rPr>
+              <w:t xml:space="preserve"> value (</w:t>
+            </w:r>
+            <w:proofErr w:type="spellStart"/>
+            <w:r>
+              <w:rPr>
+                <w:rFonts w:ascii="Times New Roman" w:eastAsia="Times New Roman" w:hAnsi="Times New Roman" w:cs="Times New Roman"/>
+                <w:b/>
+                <w:bCs/>
+                <w:kern w:val="0"/>
+                <w:sz w:val="24"/>
+                <w:szCs w:val="24"/>
+                <w:lang w:eastAsia="en-IN"/>
+                <w14:ligatures w14:val="none"/>
+              </w:rPr>
+              <w:t>Y</w:t>
+            </w:r>
+            <w:r>
+              <w:rPr>
+                <w:rFonts w:ascii="Times New Roman" w:eastAsia="Times New Roman" w:hAnsi="Times New Roman" w:cs="Times New Roman"/>
+                <w:b/>
+                <w:bCs/>
+                <w:kern w:val="0"/>
+                <w:sz w:val="24"/>
+                <w:szCs w:val="24"/>
+                <w:vertAlign w:val="subscript"/>
+                <w:lang w:eastAsia="en-IN"/>
+                <w14:ligatures w14:val="none"/>
+              </w:rPr>
+              <w:t>train_seq</w:t>
+            </w:r>
+            <w:proofErr w:type="spellEnd"/>
+            <w:r>
+              <w:rPr>
+                <w:rFonts w:ascii="Times New Roman" w:eastAsia="Times New Roman" w:hAnsi="Times New Roman" w:cs="Times New Roman"/>
+                <w:kern w:val="0"/>
+                <w:sz w:val="24"/>
+                <w:szCs w:val="24"/>
+                <w:lang w:eastAsia="en-IN"/>
+                <w14:ligatures w14:val="none"/>
+              </w:rPr>
+              <w:t>).</w:t>
+            </w:r>
+          </w:p>
+        </w:tc>
+      </w:tr>
+      <w:tr>
+        <w:trPr>
+          <w:tblCellSpacing w:w="15" w:type="dxa"/>
+        </w:trPr>
+        <w:tc>
+          <w:tcPr>
+            <w:tcW w:w="2507" w:type="dxa"/>
+            <w:vAlign w:val="center"/>
+            <w:hideMark/>
+          </w:tcPr>
+          <w:p>
+            <w:pPr>
+              <w:spacing w:before="100" w:beforeAutospacing="1" w:after="100" w:afterAutospacing="1" w:line="240" w:lineRule="auto"/>
+              <w:rPr>
+                <w:rFonts w:ascii="Times New Roman" w:eastAsia="Times New Roman" w:hAnsi="Times New Roman" w:cs="Times New Roman"/>
+                <w:kern w:val="0"/>
+                <w:sz w:val="24"/>
+                <w:szCs w:val="24"/>
+                <w:lang w:eastAsia="en-IN"/>
+                <w14:ligatures w14:val="none"/>
+              </w:rPr>
+            </w:pPr>
+            <w:r>
+              <w:rPr>
+                <w:rFonts w:ascii="Times New Roman" w:eastAsia="Times New Roman" w:hAnsi="Times New Roman" w:cs="Times New Roman"/>
+                <w:b/>
+                <w:bCs/>
+                <w:kern w:val="0"/>
+                <w:sz w:val="24"/>
+                <w:szCs w:val="24"/>
+                <w:lang w:eastAsia="en-IN"/>
+                <w14:ligatures w14:val="none"/>
+              </w:rPr>
+              <w:t>Output:</w:t>
+            </w:r>
+            <w:r>
+              <w:rPr>
+                <w:rFonts w:ascii="Times New Roman" w:eastAsia="Times New Roman" w:hAnsi="Times New Roman" w:cs="Times New Roman"/>
+                <w:kern w:val="0"/>
+                <w:sz w:val="24"/>
+                <w:szCs w:val="24"/>
+                <w:lang w:eastAsia="en-IN"/>
+                <w14:ligatures w14:val="none"/>
+              </w:rPr>
+              <w:t xml:space="preserve"> Training Complete in </w:t>
+            </w:r>
+            <w:r>
+              <w:rPr>
+                <w:rFonts w:ascii="Times New Roman" w:eastAsia="Times New Roman" w:hAnsi="Times New Roman" w:cs="Times New Roman"/>
+                <w:b/>
+                <w:bCs/>
+                <w:kern w:val="0"/>
+                <w:sz w:val="24"/>
+                <w:szCs w:val="24"/>
+                <w:lang w:eastAsia="en-IN"/>
+                <w14:ligatures w14:val="none"/>
+              </w:rPr>
+              <w:t>74.39 seconds</w:t>
+            </w:r>
+          </w:p>
+        </w:tc>
+        <w:tc>
+          <w:tcPr>
+            <w:tcW w:w="2570" w:type="dxa"/>
+            <w:vAlign w:val="center"/>
+            <w:hideMark/>
+          </w:tcPr>
+          <w:p>
+            <w:pPr>
+              <w:spacing w:before="100" w:beforeAutospacing="1" w:after="100" w:afterAutospacing="1" w:line="240" w:lineRule="auto"/>
+              <w:rPr>
+                <w:rFonts w:ascii="Times New Roman" w:eastAsia="Times New Roman" w:hAnsi="Times New Roman" w:cs="Times New Roman"/>
+                <w:kern w:val="0"/>
+                <w:sz w:val="24"/>
+                <w:szCs w:val="24"/>
+                <w:lang w:eastAsia="en-IN"/>
+                <w14:ligatures w14:val="none"/>
+              </w:rPr>
+            </w:pPr>
+            <w:r>
+              <w:rPr>
+                <w:rFonts w:ascii="Times New Roman" w:eastAsia="Times New Roman" w:hAnsi="Times New Roman" w:cs="Times New Roman"/>
+                <w:b/>
+                <w:bCs/>
+                <w:kern w:val="0"/>
+                <w:sz w:val="24"/>
+                <w:szCs w:val="24"/>
+                <w:lang w:eastAsia="en-IN"/>
+                <w14:ligatures w14:val="none"/>
+              </w:rPr>
+              <w:t>The Model's Speed.</w:t>
+            </w:r>
+          </w:p>
+        </w:tc>
+        <w:tc>
+          <w:tcPr>
+            <w:tcW w:w="5293" w:type="dxa"/>
+            <w:vAlign w:val="center"/>
+            <w:hideMark/>
+          </w:tcPr>
+          <w:p>
+            <w:pPr>
+              <w:spacing w:before="100" w:beforeAutospacing="1" w:after="100" w:afterAutospacing="1" w:line="240" w:lineRule="auto"/>
+              <w:rPr>
+                <w:rFonts w:ascii="Times New Roman" w:eastAsia="Times New Roman" w:hAnsi="Times New Roman" w:cs="Times New Roman"/>
+                <w:kern w:val="0"/>
+                <w:sz w:val="24"/>
+                <w:szCs w:val="24"/>
+                <w:lang w:eastAsia="en-IN"/>
+                <w14:ligatures w14:val="none"/>
+              </w:rPr>
+            </w:pPr>
+            <w:r>
+              <w:rPr>
+                <w:rFonts w:ascii="Times New Roman" w:eastAsia="Times New Roman" w:hAnsi="Times New Roman" w:cs="Times New Roman"/>
+                <w:kern w:val="0"/>
+                <w:sz w:val="24"/>
+                <w:szCs w:val="24"/>
+                <w:lang w:eastAsia="en-IN"/>
+                <w14:ligatures w14:val="none"/>
+              </w:rPr>
+              <w:t>GPU acceleration provided rapid training (</w:t>
+            </w:r>
+            <w:proofErr w:type="spellStart"/>
+            <w:r>
+              <w:rPr>
+                <w:rFonts w:ascii="Times New Roman" w:eastAsia="Times New Roman" w:hAnsi="Times New Roman" w:cs="Times New Roman"/>
+                <w:kern w:val="0"/>
+                <w:sz w:val="24"/>
+                <w:szCs w:val="24"/>
+                <w:lang w:eastAsia="en-IN"/>
+                <w14:ligatures w14:val="none"/>
+              </w:rPr>
+              <w:t>approx</w:t>
+            </w:r>
+            <w:proofErr w:type="spellEnd"/>
+            <w:r>
+              <w:rPr>
+                <w:rFonts w:ascii="Times New Roman" w:eastAsia="Times New Roman" w:hAnsi="Times New Roman" w:cs="Times New Roman"/>
+                <w:kern w:val="0"/>
+                <w:sz w:val="24"/>
+                <w:szCs w:val="24"/>
+                <w:lang w:eastAsia="en-IN"/>
+                <w14:ligatures w14:val="none"/>
+              </w:rPr>
+              <w:t xml:space="preserve"> 1.2 minutes), proving the efficiency gain over CPU-bound classical models for complex architectures.</w:t>
+            </w:r>
+          </w:p>
+        </w:tc>
+      </w:tr>
+    </w:tbl>
+    <w:p>
+      <w:pPr>
+        <w:spacing w:before="100" w:beforeAutospacing="1" w:after="100" w:afterAutospacing="1" w:line="240" w:lineRule="auto"/>
+        <w:rPr>
+          <w:rFonts w:ascii="Times New Roman" w:eastAsia="Times New Roman" w:hAnsi="Times New Roman" w:cs="Times New Roman"/>
+          <w:b/>
+          <w:bCs/>
+          <w:kern w:val="0"/>
+          <w:sz w:val="28"/>
+          <w:szCs w:val="28"/>
+          <w:lang w:eastAsia="en-IN"/>
+          <w14:ligatures w14:val="none"/>
+        </w:rPr>
+      </w:pPr>
+    </w:p>
+    <w:p>
+      <w:pPr>
+        <w:spacing w:before="100" w:beforeAutospacing="1" w:after="100" w:afterAutospacing="1" w:line="240" w:lineRule="auto"/>
+        <w:rPr>
+          <w:rFonts w:ascii="Times New Roman" w:eastAsia="Times New Roman" w:hAnsi="Times New Roman" w:cs="Times New Roman"/>
+          <w:b/>
+          <w:bCs/>
+          <w:kern w:val="0"/>
+          <w:sz w:val="28"/>
+          <w:szCs w:val="28"/>
+          <w:lang w:eastAsia="en-IN"/>
+          <w14:ligatures w14:val="none"/>
+        </w:rPr>
+      </w:pPr>
+      <w:r>
+        <w:rPr>
+          <w:rFonts w:ascii="Times New Roman" w:eastAsia="Times New Roman" w:hAnsi="Times New Roman" w:cs="Times New Roman"/>
+          <w:b/>
+          <w:bCs/>
+          <w:kern w:val="0"/>
+          <w:sz w:val="28"/>
+          <w:szCs w:val="28"/>
+          <w:lang w:eastAsia="en-IN"/>
+          <w14:ligatures w14:val="none"/>
+        </w:rPr>
+        <w:t>Step 13: Prediction and Evaluation (1D-CNN Final Scorecard)</w:t>
+      </w:r>
+    </w:p>
+    <w:p>
+      <w:pPr>
+        <w:spacing w:before="100" w:beforeAutospacing="1" w:after="100" w:afterAutospacing="1" w:line="240" w:lineRule="auto"/>
+        <w:rPr>
+          <w:rFonts w:ascii="Times New Roman" w:eastAsia="Times New Roman" w:hAnsi="Times New Roman" w:cs="Times New Roman"/>
+          <w:kern w:val="0"/>
+          <w:sz w:val="24"/>
+          <w:szCs w:val="24"/>
+          <w:lang w:eastAsia="en-IN"/>
+          <w14:ligatures w14:val="none"/>
+        </w:rPr>
+      </w:pPr>
+      <w:r>
+        <w:rPr>
+          <w:rFonts w:ascii="Times New Roman" w:eastAsia="Times New Roman" w:hAnsi="Times New Roman" w:cs="Times New Roman"/>
+          <w:kern w:val="0"/>
+          <w:sz w:val="24"/>
+          <w:szCs w:val="24"/>
+          <w:lang w:eastAsia="en-IN"/>
+          <w14:ligatures w14:val="none"/>
+        </w:rPr>
+        <w:t>This step generated the final load forecast using the trained CNN and calculated its accuracy.</w:t>
+      </w:r>
+    </w:p>
+    <w:tbl>
+      <w:tblPr>
+        <w:tblW w:w="0" w:type="auto"/>
+        <w:tblCellSpacing w:w="15" w:type="dxa"/>
+        <w:tblBorders>
+          <w:top w:val="single" w:sz="4" w:space="0" w:color="auto"/>
+          <w:left w:val="single" w:sz="4" w:space="0" w:color="auto"/>
+          <w:bottom w:val="single" w:sz="4" w:space="0" w:color="auto"/>
+          <w:right w:val="single" w:sz="4" w:space="0" w:color="auto"/>
+          <w:insideH w:val="single" w:sz="4" w:space="0" w:color="auto"/>
+          <w:insideV w:val="single" w:sz="4" w:space="0" w:color="auto"/>
+        </w:tblBorders>
+        <w:tblCellMar>
+          <w:top w:w="15" w:type="dxa"/>
+          <w:left w:w="15" w:type="dxa"/>
+          <w:bottom w:w="15" w:type="dxa"/>
+          <w:right w:w="15" w:type="dxa"/>
+        </w:tblCellMar>
+        <w:tblLook w:val="04A0" w:firstRow="1" w:lastRow="0" w:firstColumn="1" w:lastColumn="0" w:noHBand="0" w:noVBand="1"/>
+      </w:tblPr>
+      <w:tblGrid>
+        <w:gridCol w:w="1841"/>
+        <w:gridCol w:w="1573"/>
+        <w:gridCol w:w="5602"/>
+      </w:tblGrid>
+      <w:tr>
+        <w:trPr>
+          <w:tblHeader/>
+          <w:tblCellSpacing w:w="15" w:type="dxa"/>
+        </w:trPr>
+        <w:tc>
+          <w:tcPr>
+            <w:tcW w:w="0" w:type="auto"/>
+            <w:vAlign w:val="center"/>
+            <w:hideMark/>
+          </w:tcPr>
+          <w:p>
+            <w:pPr>
+              <w:spacing w:before="100" w:beforeAutospacing="1" w:after="100" w:afterAutospacing="1" w:line="240" w:lineRule="auto"/>
+              <w:rPr>
+                <w:rFonts w:ascii="Times New Roman" w:eastAsia="Times New Roman" w:hAnsi="Times New Roman" w:cs="Times New Roman"/>
+                <w:kern w:val="0"/>
+                <w:sz w:val="24"/>
+                <w:szCs w:val="24"/>
+                <w:lang w:eastAsia="en-IN"/>
+                <w14:ligatures w14:val="none"/>
+              </w:rPr>
+            </w:pPr>
+            <w:r>
+              <w:rPr>
+                <w:rFonts w:ascii="Times New Roman" w:eastAsia="Times New Roman" w:hAnsi="Times New Roman" w:cs="Times New Roman"/>
+                <w:b/>
+                <w:bCs/>
+                <w:kern w:val="0"/>
+                <w:sz w:val="24"/>
+                <w:szCs w:val="24"/>
+                <w:lang w:eastAsia="en-IN"/>
+                <w14:ligatures w14:val="none"/>
+              </w:rPr>
+              <w:t>Process Action</w:t>
+            </w:r>
+          </w:p>
+        </w:tc>
+        <w:tc>
+          <w:tcPr>
+            <w:tcW w:w="0" w:type="auto"/>
+            <w:vAlign w:val="center"/>
+            <w:hideMark/>
+          </w:tcPr>
+          <w:p>
+            <w:pPr>
+              <w:spacing w:before="100" w:beforeAutospacing="1" w:after="100" w:afterAutospacing="1" w:line="240" w:lineRule="auto"/>
+              <w:rPr>
+                <w:rFonts w:ascii="Times New Roman" w:eastAsia="Times New Roman" w:hAnsi="Times New Roman" w:cs="Times New Roman"/>
+                <w:kern w:val="0"/>
+                <w:sz w:val="24"/>
+                <w:szCs w:val="24"/>
+                <w:lang w:eastAsia="en-IN"/>
+                <w14:ligatures w14:val="none"/>
+              </w:rPr>
+            </w:pPr>
+            <w:r>
+              <w:rPr>
+                <w:rFonts w:ascii="Times New Roman" w:eastAsia="Times New Roman" w:hAnsi="Times New Roman" w:cs="Times New Roman"/>
+                <w:b/>
+                <w:bCs/>
+                <w:kern w:val="0"/>
+                <w:sz w:val="24"/>
+                <w:szCs w:val="24"/>
+                <w:lang w:eastAsia="en-IN"/>
+                <w14:ligatures w14:val="none"/>
+              </w:rPr>
+              <w:t>Layman's Term</w:t>
+            </w:r>
+          </w:p>
+        </w:tc>
+        <w:tc>
+          <w:tcPr>
+            <w:tcW w:w="0" w:type="auto"/>
+            <w:vAlign w:val="center"/>
+            <w:hideMark/>
+          </w:tcPr>
+          <w:p>
+            <w:pPr>
+              <w:spacing w:before="100" w:beforeAutospacing="1" w:after="100" w:afterAutospacing="1" w:line="240" w:lineRule="auto"/>
+              <w:rPr>
+                <w:rFonts w:ascii="Times New Roman" w:eastAsia="Times New Roman" w:hAnsi="Times New Roman" w:cs="Times New Roman"/>
+                <w:kern w:val="0"/>
+                <w:sz w:val="24"/>
+                <w:szCs w:val="24"/>
+                <w:lang w:eastAsia="en-IN"/>
+                <w14:ligatures w14:val="none"/>
+              </w:rPr>
+            </w:pPr>
+            <w:r>
+              <w:rPr>
+                <w:rFonts w:ascii="Times New Roman" w:eastAsia="Times New Roman" w:hAnsi="Times New Roman" w:cs="Times New Roman"/>
+                <w:b/>
+                <w:bCs/>
+                <w:kern w:val="0"/>
+                <w:sz w:val="24"/>
+                <w:szCs w:val="24"/>
+                <w:lang w:eastAsia="en-IN"/>
+                <w14:ligatures w14:val="none"/>
+              </w:rPr>
+              <w:t>Technical Role</w:t>
+            </w:r>
+          </w:p>
+        </w:tc>
+      </w:tr>
+      <w:tr>
+        <w:trPr>
+          <w:tblCellSpacing w:w="15" w:type="dxa"/>
+        </w:trPr>
+        <w:tc>
+          <w:tcPr>
+            <w:tcW w:w="0" w:type="auto"/>
+            <w:vAlign w:val="center"/>
+            <w:hideMark/>
+          </w:tcPr>
+          <w:p>
+            <w:pPr>
+              <w:spacing w:before="100" w:beforeAutospacing="1" w:after="100" w:afterAutospacing="1" w:line="240" w:lineRule="auto"/>
+              <w:rPr>
+                <w:rFonts w:ascii="Times New Roman" w:eastAsia="Times New Roman" w:hAnsi="Times New Roman" w:cs="Times New Roman"/>
+                <w:kern w:val="0"/>
+                <w:sz w:val="24"/>
+                <w:szCs w:val="24"/>
+                <w:lang w:eastAsia="en-IN"/>
+                <w14:ligatures w14:val="none"/>
+              </w:rPr>
+            </w:pPr>
+            <w:r>
+              <w:rPr>
+                <w:rFonts w:ascii="Times New Roman" w:eastAsia="Times New Roman" w:hAnsi="Times New Roman" w:cs="Times New Roman"/>
+                <w:b/>
+                <w:bCs/>
+                <w:kern w:val="0"/>
+                <w:sz w:val="24"/>
+                <w:szCs w:val="24"/>
+                <w:lang w:eastAsia="en-IN"/>
+                <w14:ligatures w14:val="none"/>
+              </w:rPr>
+              <w:t>Prediction &amp; Rescaling</w:t>
+            </w:r>
+          </w:p>
+        </w:tc>
+        <w:tc>
+          <w:tcPr>
+            <w:tcW w:w="0" w:type="auto"/>
+            <w:vAlign w:val="center"/>
+            <w:hideMark/>
+          </w:tcPr>
+          <w:p>
+            <w:pPr>
+              <w:spacing w:before="100" w:beforeAutospacing="1" w:after="100" w:afterAutospacing="1" w:line="240" w:lineRule="auto"/>
+              <w:rPr>
+                <w:rFonts w:ascii="Times New Roman" w:eastAsia="Times New Roman" w:hAnsi="Times New Roman" w:cs="Times New Roman"/>
+                <w:kern w:val="0"/>
+                <w:sz w:val="24"/>
+                <w:szCs w:val="24"/>
+                <w:lang w:eastAsia="en-IN"/>
+                <w14:ligatures w14:val="none"/>
+              </w:rPr>
+            </w:pPr>
+            <w:r>
+              <w:rPr>
+                <w:rFonts w:ascii="Times New Roman" w:eastAsia="Times New Roman" w:hAnsi="Times New Roman" w:cs="Times New Roman"/>
+                <w:b/>
+                <w:bCs/>
+                <w:kern w:val="0"/>
+                <w:sz w:val="24"/>
+                <w:szCs w:val="24"/>
+                <w:lang w:eastAsia="en-IN"/>
+                <w14:ligatures w14:val="none"/>
+              </w:rPr>
+              <w:t>Predicting Noise &amp; Resizing.</w:t>
+            </w:r>
+          </w:p>
+        </w:tc>
+        <w:tc>
+          <w:tcPr>
+            <w:tcW w:w="0" w:type="auto"/>
+            <w:vAlign w:val="center"/>
+            <w:hideMark/>
+          </w:tcPr>
+          <w:p>
+            <w:pPr>
+              <w:spacing w:before="100" w:beforeAutospacing="1" w:after="100" w:afterAutospacing="1" w:line="240" w:lineRule="auto"/>
+              <w:rPr>
+                <w:rFonts w:ascii="Times New Roman" w:eastAsia="Times New Roman" w:hAnsi="Times New Roman" w:cs="Times New Roman"/>
+                <w:kern w:val="0"/>
+                <w:sz w:val="24"/>
+                <w:szCs w:val="24"/>
+                <w:lang w:eastAsia="en-IN"/>
+                <w14:ligatures w14:val="none"/>
+              </w:rPr>
+            </w:pPr>
+            <w:r>
+              <w:rPr>
+                <w:rFonts w:ascii="Times New Roman" w:eastAsia="Times New Roman" w:hAnsi="Times New Roman" w:cs="Times New Roman"/>
+                <w:kern w:val="0"/>
+                <w:sz w:val="24"/>
+                <w:szCs w:val="24"/>
+                <w:lang w:eastAsia="en-IN"/>
+                <w14:ligatures w14:val="none"/>
+              </w:rPr>
+              <w:t xml:space="preserve">The CNN predicted the </w:t>
+            </w:r>
+            <w:r>
+              <w:rPr>
+                <w:rFonts w:ascii="Times New Roman" w:eastAsia="Times New Roman" w:hAnsi="Times New Roman" w:cs="Times New Roman"/>
+                <w:i/>
+                <w:iCs/>
+                <w:kern w:val="0"/>
+                <w:sz w:val="24"/>
+                <w:szCs w:val="24"/>
+                <w:lang w:eastAsia="en-IN"/>
+                <w14:ligatures w14:val="none"/>
+              </w:rPr>
+              <w:t>scaled</w:t>
+            </w:r>
+            <w:r>
+              <w:rPr>
+                <w:rFonts w:ascii="Times New Roman" w:eastAsia="Times New Roman" w:hAnsi="Times New Roman" w:cs="Times New Roman"/>
+                <w:kern w:val="0"/>
+                <w:sz w:val="24"/>
+                <w:szCs w:val="24"/>
+                <w:lang w:eastAsia="en-IN"/>
+                <w14:ligatures w14:val="none"/>
+              </w:rPr>
+              <w:t xml:space="preserve"> residual (</w:t>
+            </w:r>
+            <m:oMath>
+              <m:acc>
+                <m:accPr>
+                  <m:ctrlPr>
+                    <w:rPr>
+                      <w:rFonts w:ascii="Cambria Math" w:eastAsia="Times New Roman" w:hAnsi="Cambria Math" w:cs="Times New Roman"/>
+                      <w:b/>
+                      <w:bCs/>
+                      <w:i/>
+                      <w:kern w:val="0"/>
+                      <w:sz w:val="24"/>
+                      <w:szCs w:val="24"/>
+                      <w:lang w:eastAsia="en-IN"/>
+                      <w14:ligatures w14:val="none"/>
+                    </w:rPr>
+                  </m:ctrlPr>
+                </m:accPr>
+                <m:e>
+                  <m:r>
+                    <m:rPr>
+                      <m:sty m:val="bi"/>
+                    </m:rPr>
+                    <w:rPr>
+                      <w:rFonts w:ascii="Cambria Math" w:eastAsia="Times New Roman" w:hAnsi="Cambria Math" w:cs="Times New Roman"/>
+                      <w:kern w:val="0"/>
+                      <w:sz w:val="24"/>
+                      <w:szCs w:val="24"/>
+                      <w:lang w:eastAsia="en-IN"/>
+                      <w14:ligatures w14:val="none"/>
+                    </w:rPr>
+                    <m:t>R</m:t>
+                  </m:r>
+                </m:e>
+              </m:acc>
+            </m:oMath>
+            <w:r>
+              <w:rPr>
+                <w:rFonts w:ascii="Times New Roman" w:eastAsia="Times New Roman" w:hAnsi="Times New Roman" w:cs="Times New Roman"/>
+                <w:b/>
+                <w:bCs/>
+                <w:kern w:val="0"/>
+                <w:sz w:val="24"/>
+                <w:szCs w:val="24"/>
+                <w:vertAlign w:val="subscript"/>
+                <w:lang w:eastAsia="en-IN"/>
+                <w14:ligatures w14:val="none"/>
+              </w:rPr>
+              <w:t>scaled_test</w:t>
+            </w:r>
+            <w:r>
+              <w:rPr>
+                <w:rFonts w:ascii="Times New Roman" w:eastAsia="Times New Roman" w:hAnsi="Times New Roman" w:cs="Times New Roman"/>
+                <w:kern w:val="0"/>
+                <w:sz w:val="24"/>
+                <w:szCs w:val="24"/>
+                <w:lang w:eastAsia="en-IN"/>
+                <w14:ligatures w14:val="none"/>
+              </w:rPr>
+              <w:t xml:space="preserve">). The </w:t>
+            </w:r>
+            <w:proofErr w:type="spellStart"/>
+            <w:proofErr w:type="gramStart"/>
+            <w:r>
+              <w:rPr>
+                <w:rFonts w:ascii="Times New Roman" w:eastAsia="Times New Roman" w:hAnsi="Times New Roman" w:cs="Times New Roman"/>
+                <w:b/>
+                <w:bCs/>
+                <w:kern w:val="0"/>
+                <w:sz w:val="24"/>
+                <w:szCs w:val="24"/>
+                <w:lang w:eastAsia="en-IN"/>
+                <w14:ligatures w14:val="none"/>
+              </w:rPr>
+              <w:t>scaler.inverse</w:t>
+            </w:r>
+            <w:proofErr w:type="gramEnd"/>
+            <w:r>
+              <w:rPr>
+                <w:rFonts w:ascii="Times New Roman" w:eastAsia="Times New Roman" w:hAnsi="Times New Roman" w:cs="Times New Roman"/>
+                <w:b/>
+                <w:bCs/>
+                <w:kern w:val="0"/>
+                <w:sz w:val="24"/>
+                <w:szCs w:val="24"/>
+                <w:lang w:eastAsia="en-IN"/>
+                <w14:ligatures w14:val="none"/>
+              </w:rPr>
+              <w:t>_transform</w:t>
+            </w:r>
+            <w:proofErr w:type="spellEnd"/>
+            <w:r>
+              <w:rPr>
+                <w:rFonts w:ascii="Times New Roman" w:eastAsia="Times New Roman" w:hAnsi="Times New Roman" w:cs="Times New Roman"/>
+                <w:kern w:val="0"/>
+                <w:sz w:val="24"/>
+                <w:szCs w:val="24"/>
+                <w:lang w:eastAsia="en-IN"/>
+                <w14:ligatures w14:val="none"/>
+              </w:rPr>
+              <w:t xml:space="preserve"> function converted these predictions back to the original kilowatt units (</w:t>
+            </w:r>
+            <m:oMath>
+              <m:acc>
+                <m:accPr>
+                  <m:ctrlPr>
+                    <w:rPr>
+                      <w:rFonts w:ascii="Cambria Math" w:eastAsia="Times New Roman" w:hAnsi="Cambria Math" w:cs="Times New Roman"/>
+                      <w:b/>
+                      <w:bCs/>
+                      <w:i/>
+                      <w:kern w:val="0"/>
+                      <w:sz w:val="24"/>
+                      <w:szCs w:val="24"/>
+                      <w:lang w:eastAsia="en-IN"/>
+                      <w14:ligatures w14:val="none"/>
+                    </w:rPr>
+                  </m:ctrlPr>
+                </m:accPr>
+                <m:e>
+                  <m:r>
+                    <m:rPr>
+                      <m:sty m:val="bi"/>
+                    </m:rPr>
+                    <w:rPr>
+                      <w:rFonts w:ascii="Cambria Math" w:eastAsia="Times New Roman" w:hAnsi="Cambria Math" w:cs="Times New Roman"/>
+                      <w:kern w:val="0"/>
+                      <w:sz w:val="24"/>
+                      <w:szCs w:val="24"/>
+                      <w:lang w:eastAsia="en-IN"/>
+                      <w14:ligatures w14:val="none"/>
+                    </w:rPr>
+                    <m:t>R</m:t>
+                  </m:r>
+                </m:e>
+              </m:acc>
+            </m:oMath>
+            <w:r>
+              <w:rPr>
+                <w:rFonts w:ascii="Times New Roman" w:eastAsia="Times New Roman" w:hAnsi="Times New Roman" w:cs="Times New Roman"/>
+                <w:b/>
+                <w:bCs/>
+                <w:kern w:val="0"/>
+                <w:sz w:val="24"/>
+                <w:szCs w:val="24"/>
+                <w:vertAlign w:val="subscript"/>
+                <w:lang w:eastAsia="en-IN"/>
+                <w14:ligatures w14:val="none"/>
+              </w:rPr>
+              <w:t>test</w:t>
+            </w:r>
+            <w:r>
+              <w:rPr>
+                <w:rFonts w:ascii="Times New Roman" w:eastAsia="Times New Roman" w:hAnsi="Times New Roman" w:cs="Times New Roman"/>
+                <w:kern w:val="0"/>
+                <w:sz w:val="24"/>
+                <w:szCs w:val="24"/>
+                <w:lang w:eastAsia="en-IN"/>
+                <w14:ligatures w14:val="none"/>
+              </w:rPr>
+              <w:t>).</w:t>
+            </w:r>
+          </w:p>
+        </w:tc>
+      </w:tr>
+      <w:tr>
+        <w:trPr>
+          <w:tblCellSpacing w:w="15" w:type="dxa"/>
+        </w:trPr>
+        <w:tc>
+          <w:tcPr>
+            <w:tcW w:w="0" w:type="auto"/>
+            <w:vAlign w:val="center"/>
+            <w:hideMark/>
+          </w:tcPr>
+          <w:p>
+            <w:pPr>
+              <w:spacing w:before="100" w:beforeAutospacing="1" w:after="100" w:afterAutospacing="1" w:line="240" w:lineRule="auto"/>
+              <w:rPr>
+                <w:rFonts w:ascii="Times New Roman" w:eastAsia="Times New Roman" w:hAnsi="Times New Roman" w:cs="Times New Roman"/>
+                <w:kern w:val="0"/>
+                <w:sz w:val="24"/>
+                <w:szCs w:val="24"/>
+                <w:lang w:eastAsia="en-IN"/>
+                <w14:ligatures w14:val="none"/>
+              </w:rPr>
+            </w:pPr>
+            <w:r>
+              <w:rPr>
+                <w:rFonts w:ascii="Times New Roman" w:eastAsia="Times New Roman" w:hAnsi="Times New Roman" w:cs="Times New Roman"/>
+                <w:b/>
+                <w:bCs/>
+                <w:kern w:val="0"/>
+                <w:sz w:val="24"/>
+                <w:szCs w:val="24"/>
+                <w:lang w:eastAsia="en-IN"/>
+                <w14:ligatures w14:val="none"/>
+              </w:rPr>
+              <w:t>Reconstruction</w:t>
+            </w:r>
+          </w:p>
+        </w:tc>
+        <w:tc>
+          <w:tcPr>
+            <w:tcW w:w="0" w:type="auto"/>
+            <w:vAlign w:val="center"/>
+            <w:hideMark/>
+          </w:tcPr>
+          <w:p>
+            <w:pPr>
+              <w:spacing w:before="100" w:beforeAutospacing="1" w:after="100" w:afterAutospacing="1" w:line="240" w:lineRule="auto"/>
+              <w:rPr>
+                <w:rFonts w:ascii="Times New Roman" w:eastAsia="Times New Roman" w:hAnsi="Times New Roman" w:cs="Times New Roman"/>
+                <w:kern w:val="0"/>
+                <w:sz w:val="24"/>
+                <w:szCs w:val="24"/>
+                <w:lang w:eastAsia="en-IN"/>
+                <w14:ligatures w14:val="none"/>
+              </w:rPr>
+            </w:pPr>
+            <w:r>
+              <w:rPr>
+                <w:rFonts w:ascii="Times New Roman" w:eastAsia="Times New Roman" w:hAnsi="Times New Roman" w:cs="Times New Roman"/>
+                <w:b/>
+                <w:bCs/>
+                <w:kern w:val="0"/>
+                <w:sz w:val="24"/>
+                <w:szCs w:val="24"/>
+                <w:lang w:eastAsia="en-IN"/>
+                <w14:ligatures w14:val="none"/>
+              </w:rPr>
+              <w:t>Putting the Puzzle Together.</w:t>
+            </w:r>
+          </w:p>
+        </w:tc>
+        <w:tc>
+          <w:tcPr>
+            <w:tcW w:w="0" w:type="auto"/>
+            <w:vAlign w:val="center"/>
+            <w:hideMark/>
+          </w:tcPr>
+          <w:p>
+            <w:pPr>
+              <w:spacing w:before="100" w:beforeAutospacing="1" w:after="100" w:afterAutospacing="1" w:line="240" w:lineRule="auto"/>
+              <w:rPr>
+                <w:rFonts w:ascii="Times New Roman" w:eastAsia="Times New Roman" w:hAnsi="Times New Roman" w:cs="Times New Roman"/>
+                <w:kern w:val="0"/>
+                <w:sz w:val="24"/>
+                <w:szCs w:val="24"/>
+                <w:lang w:eastAsia="en-IN"/>
+                <w14:ligatures w14:val="none"/>
+              </w:rPr>
+            </w:pPr>
+            <w:r>
+              <w:rPr>
+                <w:rFonts w:ascii="Times New Roman" w:eastAsia="Times New Roman" w:hAnsi="Times New Roman" w:cs="Times New Roman"/>
+                <w:kern w:val="0"/>
+                <w:sz w:val="24"/>
+                <w:szCs w:val="24"/>
+                <w:lang w:eastAsia="en-IN"/>
+                <w14:ligatures w14:val="none"/>
+              </w:rPr>
+              <w:t>The final forecast (</w:t>
+            </w:r>
+            <m:oMath>
+              <m:acc>
+                <m:accPr>
+                  <m:ctrlPr>
+                    <w:rPr>
+                      <w:rFonts w:ascii="Cambria Math" w:eastAsia="Times New Roman" w:hAnsi="Cambria Math" w:cs="Times New Roman"/>
+                      <w:b/>
+                      <w:bCs/>
+                      <w:i/>
+                      <w:kern w:val="0"/>
+                      <w:sz w:val="24"/>
+                      <w:szCs w:val="24"/>
+                      <w:lang w:eastAsia="en-IN"/>
+                      <w14:ligatures w14:val="none"/>
+                    </w:rPr>
+                  </m:ctrlPr>
+                </m:accPr>
+                <m:e>
+                  <m:r>
+                    <m:rPr>
+                      <m:sty m:val="bi"/>
+                    </m:rPr>
+                    <w:rPr>
+                      <w:rFonts w:ascii="Cambria Math" w:eastAsia="Times New Roman" w:hAnsi="Cambria Math" w:cs="Times New Roman"/>
+                      <w:kern w:val="0"/>
+                      <w:sz w:val="24"/>
+                      <w:szCs w:val="24"/>
+                      <w:lang w:eastAsia="en-IN"/>
+                      <w14:ligatures w14:val="none"/>
+                    </w:rPr>
+                    <m:t>Y</m:t>
+                  </m:r>
+                </m:e>
+              </m:acc>
+            </m:oMath>
+            <w:r>
+              <w:rPr>
+                <w:rFonts w:ascii="Times New Roman" w:eastAsia="Times New Roman" w:hAnsi="Times New Roman" w:cs="Times New Roman"/>
+                <w:b/>
+                <w:bCs/>
+                <w:kern w:val="0"/>
+                <w:sz w:val="24"/>
+                <w:szCs w:val="24"/>
+                <w:vertAlign w:val="subscript"/>
+                <w:lang w:eastAsia="en-IN"/>
+                <w14:ligatures w14:val="none"/>
+              </w:rPr>
+              <w:t>cnn_test</w:t>
+            </w:r>
+            <w:r>
+              <w:rPr>
+                <w:rFonts w:ascii="Times New Roman" w:eastAsia="Times New Roman" w:hAnsi="Times New Roman" w:cs="Times New Roman"/>
+                <w:kern w:val="0"/>
+                <w:sz w:val="24"/>
+                <w:szCs w:val="24"/>
+                <w:lang w:eastAsia="en-IN"/>
+                <w14:ligatures w14:val="none"/>
+              </w:rPr>
+              <w:t xml:space="preserve">) was reconstructed by adding the predicted residual </w:t>
+            </w:r>
+            <w:r>
+              <w:rPr>
+                <w:rFonts w:ascii="Times New Roman" w:eastAsia="Times New Roman" w:hAnsi="Times New Roman" w:cs="Times New Roman"/>
+                <w:kern w:val="0"/>
+                <w:sz w:val="24"/>
+                <w:szCs w:val="24"/>
+                <w:lang w:eastAsia="en-IN"/>
+                <w14:ligatures w14:val="none"/>
+              </w:rPr>
+              <w:t>(</w:t>
+            </w:r>
+            <m:oMath>
+              <m:acc>
+                <m:accPr>
+                  <m:ctrlPr>
+                    <w:rPr>
+                      <w:rFonts w:ascii="Cambria Math" w:eastAsia="Times New Roman" w:hAnsi="Cambria Math" w:cs="Times New Roman"/>
+                      <w:b/>
+                      <w:bCs/>
+                      <w:i/>
+                      <w:kern w:val="0"/>
+                      <w:sz w:val="24"/>
+                      <w:szCs w:val="24"/>
+                      <w:lang w:eastAsia="en-IN"/>
+                      <w14:ligatures w14:val="none"/>
+                    </w:rPr>
+                  </m:ctrlPr>
+                </m:accPr>
+                <m:e>
+                  <m:r>
+                    <m:rPr>
+                      <m:sty m:val="bi"/>
+                    </m:rPr>
+                    <w:rPr>
+                      <w:rFonts w:ascii="Cambria Math" w:eastAsia="Times New Roman" w:hAnsi="Cambria Math" w:cs="Times New Roman"/>
+                      <w:kern w:val="0"/>
+                      <w:sz w:val="24"/>
+                      <w:szCs w:val="24"/>
+                      <w:lang w:eastAsia="en-IN"/>
+                      <w14:ligatures w14:val="none"/>
+                    </w:rPr>
+                    <m:t>R</m:t>
+                  </m:r>
+                </m:e>
+              </m:acc>
+            </m:oMath>
+            <w:r>
+              <w:rPr>
+                <w:rFonts w:ascii="Times New Roman" w:eastAsia="Times New Roman" w:hAnsi="Times New Roman" w:cs="Times New Roman"/>
+                <w:b/>
+                <w:bCs/>
+                <w:kern w:val="0"/>
+                <w:sz w:val="24"/>
+                <w:szCs w:val="24"/>
+                <w:vertAlign w:val="subscript"/>
+                <w:lang w:eastAsia="en-IN"/>
+                <w14:ligatures w14:val="none"/>
+              </w:rPr>
+              <w:t>test</w:t>
+            </w:r>
+            <w:r>
+              <w:rPr>
+                <w:rFonts w:ascii="Times New Roman" w:eastAsia="Times New Roman" w:hAnsi="Times New Roman" w:cs="Times New Roman"/>
+                <w:kern w:val="0"/>
+                <w:sz w:val="24"/>
+                <w:szCs w:val="24"/>
+                <w:lang w:eastAsia="en-IN"/>
+                <w14:ligatures w14:val="none"/>
+              </w:rPr>
+              <w:t>)</w:t>
+            </w:r>
+            <w:r>
+              <w:rPr>
+                <w:rFonts w:ascii="Times New Roman" w:eastAsia="Times New Roman" w:hAnsi="Times New Roman" w:cs="Times New Roman"/>
+                <w:kern w:val="0"/>
+                <w:sz w:val="24"/>
+                <w:szCs w:val="24"/>
+                <w:lang w:eastAsia="en-IN"/>
+                <w14:ligatures w14:val="none"/>
+              </w:rPr>
+              <w:t xml:space="preserve"> </w:t>
+            </w:r>
+            <w:r>
+              <w:rPr>
+                <w:rFonts w:ascii="Times New Roman" w:eastAsia="Times New Roman" w:hAnsi="Times New Roman" w:cs="Times New Roman"/>
+                <w:kern w:val="0"/>
+                <w:sz w:val="24"/>
+                <w:szCs w:val="24"/>
+                <w:lang w:eastAsia="en-IN"/>
+                <w14:ligatures w14:val="none"/>
+              </w:rPr>
+              <w:t>to the known Trend (</w:t>
+            </w:r>
+            <w:proofErr w:type="spellStart"/>
+            <w:r>
+              <w:rPr>
+                <w:rFonts w:ascii="Times New Roman" w:eastAsia="Times New Roman" w:hAnsi="Times New Roman" w:cs="Times New Roman"/>
+                <w:b/>
+                <w:bCs/>
+                <w:i/>
+                <w:iCs/>
+                <w:kern w:val="0"/>
+                <w:sz w:val="24"/>
+                <w:szCs w:val="24"/>
+                <w:lang w:eastAsia="en-IN"/>
+                <w14:ligatures w14:val="none"/>
+              </w:rPr>
+              <w:t>T</w:t>
+            </w:r>
+            <w:r>
+              <w:rPr>
+                <w:rFonts w:ascii="Times New Roman" w:eastAsia="Times New Roman" w:hAnsi="Times New Roman" w:cs="Times New Roman"/>
+                <w:b/>
+                <w:bCs/>
+                <w:kern w:val="0"/>
+                <w:sz w:val="24"/>
+                <w:szCs w:val="24"/>
+                <w:vertAlign w:val="subscript"/>
+                <w:lang w:eastAsia="en-IN"/>
+                <w14:ligatures w14:val="none"/>
+              </w:rPr>
+              <w:t>test</w:t>
+            </w:r>
+            <w:proofErr w:type="spellEnd"/>
+            <w:r>
+              <w:rPr>
+                <w:rFonts w:ascii="Times New Roman" w:eastAsia="Times New Roman" w:hAnsi="Times New Roman" w:cs="Times New Roman"/>
+                <w:kern w:val="0"/>
+                <w:sz w:val="24"/>
+                <w:szCs w:val="24"/>
+                <w:lang w:eastAsia="en-IN"/>
+                <w14:ligatures w14:val="none"/>
+              </w:rPr>
+              <w:t>) and Seasonal (</w:t>
+            </w:r>
+            <w:proofErr w:type="spellStart"/>
+            <w:r>
+              <w:rPr>
+                <w:rFonts w:ascii="Times New Roman" w:eastAsia="Times New Roman" w:hAnsi="Times New Roman" w:cs="Times New Roman"/>
+                <w:b/>
+                <w:bCs/>
+                <w:i/>
+                <w:iCs/>
+                <w:kern w:val="0"/>
+                <w:sz w:val="24"/>
+                <w:szCs w:val="24"/>
+                <w:lang w:eastAsia="en-IN"/>
+                <w14:ligatures w14:val="none"/>
+              </w:rPr>
+              <w:t>S</w:t>
+            </w:r>
+            <w:r>
+              <w:rPr>
+                <w:rFonts w:ascii="Times New Roman" w:eastAsia="Times New Roman" w:hAnsi="Times New Roman" w:cs="Times New Roman"/>
+                <w:b/>
+                <w:bCs/>
+                <w:kern w:val="0"/>
+                <w:sz w:val="24"/>
+                <w:szCs w:val="24"/>
+                <w:vertAlign w:val="subscript"/>
+                <w:lang w:eastAsia="en-IN"/>
+                <w14:ligatures w14:val="none"/>
+              </w:rPr>
+              <w:t>test</w:t>
+            </w:r>
+            <w:proofErr w:type="spellEnd"/>
+            <w:r>
+              <w:rPr>
+                <w:rFonts w:ascii="Times New Roman" w:eastAsia="Times New Roman" w:hAnsi="Times New Roman" w:cs="Times New Roman"/>
+                <w:kern w:val="0"/>
+                <w:sz w:val="24"/>
+                <w:szCs w:val="24"/>
+                <w:lang w:eastAsia="en-IN"/>
+                <w14:ligatures w14:val="none"/>
+              </w:rPr>
+              <w:t>) components.</w:t>
+            </w:r>
+          </w:p>
+        </w:tc>
+      </w:tr>
+      <w:tr>
+        <w:trPr>
+          <w:tblCellSpacing w:w="15" w:type="dxa"/>
+        </w:trPr>
+        <w:tc>
+          <w:tcPr>
+            <w:tcW w:w="0" w:type="auto"/>
+            <w:vAlign w:val="center"/>
+            <w:hideMark/>
+          </w:tcPr>
+          <w:p>
+            <w:pPr>
+              <w:spacing w:before="100" w:beforeAutospacing="1" w:after="100" w:afterAutospacing="1" w:line="240" w:lineRule="auto"/>
+              <w:rPr>
+                <w:rFonts w:ascii="Times New Roman" w:eastAsia="Times New Roman" w:hAnsi="Times New Roman" w:cs="Times New Roman"/>
+                <w:kern w:val="0"/>
+                <w:sz w:val="24"/>
+                <w:szCs w:val="24"/>
+                <w:lang w:eastAsia="en-IN"/>
+                <w14:ligatures w14:val="none"/>
+              </w:rPr>
+            </w:pPr>
+            <w:r>
+              <w:rPr>
+                <w:rFonts w:ascii="Times New Roman" w:eastAsia="Times New Roman" w:hAnsi="Times New Roman" w:cs="Times New Roman"/>
+                <w:b/>
+                <w:bCs/>
+                <w:kern w:val="0"/>
+                <w:sz w:val="24"/>
+                <w:szCs w:val="24"/>
+                <w:lang w:eastAsia="en-IN"/>
+                <w14:ligatures w14:val="none"/>
+              </w:rPr>
+              <w:t>Evaluation Command</w:t>
+            </w:r>
+          </w:p>
+        </w:tc>
+        <w:tc>
+          <w:tcPr>
+            <w:tcW w:w="0" w:type="auto"/>
+            <w:vAlign w:val="center"/>
+            <w:hideMark/>
+          </w:tcPr>
+          <w:p>
+            <w:pPr>
+              <w:spacing w:before="100" w:beforeAutospacing="1" w:after="100" w:afterAutospacing="1" w:line="240" w:lineRule="auto"/>
+              <w:rPr>
+                <w:rFonts w:ascii="Times New Roman" w:eastAsia="Times New Roman" w:hAnsi="Times New Roman" w:cs="Times New Roman"/>
+                <w:kern w:val="0"/>
+                <w:sz w:val="24"/>
+                <w:szCs w:val="24"/>
+                <w:lang w:eastAsia="en-IN"/>
+                <w14:ligatures w14:val="none"/>
+              </w:rPr>
+            </w:pPr>
+            <w:r>
+              <w:rPr>
+                <w:rFonts w:ascii="Times New Roman" w:eastAsia="Times New Roman" w:hAnsi="Times New Roman" w:cs="Times New Roman"/>
+                <w:b/>
+                <w:bCs/>
+                <w:kern w:val="0"/>
+                <w:sz w:val="24"/>
+                <w:szCs w:val="24"/>
+                <w:lang w:eastAsia="en-IN"/>
+                <w14:ligatures w14:val="none"/>
+              </w:rPr>
+              <w:t>The Final Grade.</w:t>
+            </w:r>
+          </w:p>
+        </w:tc>
+        <w:tc>
+          <w:tcPr>
+            <w:tcW w:w="0" w:type="auto"/>
+            <w:vAlign w:val="center"/>
+            <w:hideMark/>
+          </w:tcPr>
+          <w:p>
+            <w:pPr>
+              <w:spacing w:before="100" w:beforeAutospacing="1" w:after="100" w:afterAutospacing="1" w:line="240" w:lineRule="auto"/>
+              <w:rPr>
+                <w:rFonts w:ascii="Times New Roman" w:eastAsia="Times New Roman" w:hAnsi="Times New Roman" w:cs="Times New Roman"/>
+                <w:kern w:val="0"/>
+                <w:sz w:val="24"/>
+                <w:szCs w:val="24"/>
+                <w:lang w:eastAsia="en-IN"/>
+                <w14:ligatures w14:val="none"/>
+              </w:rPr>
+            </w:pPr>
+            <w:r>
+              <w:rPr>
+                <w:rFonts w:ascii="Times New Roman" w:eastAsia="Times New Roman" w:hAnsi="Times New Roman" w:cs="Times New Roman"/>
+                <w:kern w:val="0"/>
+                <w:sz w:val="24"/>
+                <w:szCs w:val="24"/>
+                <w:lang w:eastAsia="en-IN"/>
+                <w14:ligatures w14:val="none"/>
+              </w:rPr>
+              <w:t>Accuracy formulas (</w:t>
+            </w:r>
+            <w:r>
+              <w:rPr>
+                <w:rFonts w:ascii="Times New Roman" w:eastAsia="Times New Roman" w:hAnsi="Times New Roman" w:cs="Times New Roman"/>
+                <w:b/>
+                <w:bCs/>
+                <w:kern w:val="0"/>
+                <w:sz w:val="24"/>
+                <w:szCs w:val="24"/>
+                <w:lang w:eastAsia="en-IN"/>
+                <w14:ligatures w14:val="none"/>
+              </w:rPr>
+              <w:t xml:space="preserve">MAE, RMSE, </w:t>
+            </w:r>
+            <w:proofErr w:type="spellStart"/>
+            <w:r>
+              <w:rPr>
+                <w:rFonts w:ascii="Times New Roman" w:eastAsia="Times New Roman" w:hAnsi="Times New Roman" w:cs="Times New Roman"/>
+                <w:b/>
+                <w:bCs/>
+                <w:kern w:val="0"/>
+                <w:sz w:val="24"/>
+                <w:szCs w:val="24"/>
+                <w:lang w:eastAsia="en-IN"/>
+                <w14:ligatures w14:val="none"/>
+              </w:rPr>
+              <w:t>sMAPE</w:t>
+            </w:r>
+            <w:proofErr w:type="spellEnd"/>
+            <w:r>
+              <w:rPr>
+                <w:rFonts w:ascii="Times New Roman" w:eastAsia="Times New Roman" w:hAnsi="Times New Roman" w:cs="Times New Roman"/>
+                <w:kern w:val="0"/>
+                <w:sz w:val="24"/>
+                <w:szCs w:val="24"/>
+                <w:lang w:eastAsia="en-IN"/>
+                <w14:ligatures w14:val="none"/>
+              </w:rPr>
+              <w:t xml:space="preserve">) compared the reconstructed forecast </w:t>
+            </w:r>
+            <w:r>
+              <w:rPr>
+                <w:rFonts w:ascii="Times New Roman" w:eastAsia="Times New Roman" w:hAnsi="Times New Roman" w:cs="Times New Roman"/>
+                <w:kern w:val="0"/>
+                <w:sz w:val="24"/>
+                <w:szCs w:val="24"/>
+                <w:lang w:eastAsia="en-IN"/>
+                <w14:ligatures w14:val="none"/>
+              </w:rPr>
+              <w:t>(</w:t>
+            </w:r>
+            <m:oMath>
+              <m:acc>
+                <m:accPr>
+                  <m:ctrlPr>
+                    <w:rPr>
+                      <w:rFonts w:ascii="Cambria Math" w:eastAsia="Times New Roman" w:hAnsi="Cambria Math" w:cs="Times New Roman"/>
+                      <w:b/>
+                      <w:bCs/>
+                      <w:i/>
+                      <w:kern w:val="0"/>
+                      <w:sz w:val="24"/>
+                      <w:szCs w:val="24"/>
+                      <w:lang w:eastAsia="en-IN"/>
+                      <w14:ligatures w14:val="none"/>
+                    </w:rPr>
+                  </m:ctrlPr>
+                </m:accPr>
+                <m:e>
+                  <m:r>
+                    <m:rPr>
+                      <m:sty m:val="bi"/>
+                    </m:rPr>
+                    <w:rPr>
+                      <w:rFonts w:ascii="Cambria Math" w:eastAsia="Times New Roman" w:hAnsi="Cambria Math" w:cs="Times New Roman"/>
+                      <w:kern w:val="0"/>
+                      <w:sz w:val="24"/>
+                      <w:szCs w:val="24"/>
+                      <w:lang w:eastAsia="en-IN"/>
+                      <w14:ligatures w14:val="none"/>
+                    </w:rPr>
+                    <m:t>Y</m:t>
+                  </m:r>
+                </m:e>
+              </m:acc>
+            </m:oMath>
+            <w:r>
+              <w:rPr>
+                <w:rFonts w:ascii="Times New Roman" w:eastAsia="Times New Roman" w:hAnsi="Times New Roman" w:cs="Times New Roman"/>
+                <w:b/>
+                <w:bCs/>
+                <w:kern w:val="0"/>
+                <w:sz w:val="24"/>
+                <w:szCs w:val="24"/>
+                <w:vertAlign w:val="subscript"/>
+                <w:lang w:eastAsia="en-IN"/>
+                <w14:ligatures w14:val="none"/>
+              </w:rPr>
+              <w:t>cnn_test</w:t>
+            </w:r>
+            <w:r>
+              <w:rPr>
+                <w:rFonts w:ascii="Times New Roman" w:eastAsia="Times New Roman" w:hAnsi="Times New Roman" w:cs="Times New Roman"/>
+                <w:kern w:val="0"/>
+                <w:sz w:val="24"/>
+                <w:szCs w:val="24"/>
+                <w:lang w:eastAsia="en-IN"/>
+                <w14:ligatures w14:val="none"/>
+              </w:rPr>
+              <w:t xml:space="preserve">) </w:t>
+            </w:r>
+            <w:r>
+              <w:rPr>
+                <w:rFonts w:ascii="Times New Roman" w:eastAsia="Times New Roman" w:hAnsi="Times New Roman" w:cs="Times New Roman"/>
+                <w:kern w:val="0"/>
+                <w:sz w:val="24"/>
+                <w:szCs w:val="24"/>
+                <w:lang w:eastAsia="en-IN"/>
+                <w14:ligatures w14:val="none"/>
+              </w:rPr>
+              <w:t>to the true actual load (</w:t>
+            </w:r>
+            <w:proofErr w:type="spellStart"/>
+            <w:r>
+              <w:rPr>
+                <w:rFonts w:ascii="Times New Roman" w:eastAsia="Times New Roman" w:hAnsi="Times New Roman" w:cs="Times New Roman"/>
+                <w:b/>
+                <w:bCs/>
+                <w:i/>
+                <w:iCs/>
+                <w:kern w:val="0"/>
+                <w:sz w:val="24"/>
+                <w:szCs w:val="24"/>
+                <w:lang w:eastAsia="en-IN"/>
+                <w14:ligatures w14:val="none"/>
+              </w:rPr>
+              <w:t>Y</w:t>
+            </w:r>
+            <w:r>
+              <w:rPr>
+                <w:rFonts w:ascii="Times New Roman" w:eastAsia="Times New Roman" w:hAnsi="Times New Roman" w:cs="Times New Roman"/>
+                <w:b/>
+                <w:bCs/>
+                <w:kern w:val="0"/>
+                <w:sz w:val="24"/>
+                <w:szCs w:val="24"/>
+                <w:vertAlign w:val="subscript"/>
+                <w:lang w:eastAsia="en-IN"/>
+                <w14:ligatures w14:val="none"/>
+              </w:rPr>
+              <w:t>load_test</w:t>
+            </w:r>
+            <w:proofErr w:type="spellEnd"/>
+            <w:r>
+              <w:rPr>
+                <w:rFonts w:ascii="Times New Roman" w:eastAsia="Times New Roman" w:hAnsi="Times New Roman" w:cs="Times New Roman"/>
+                <w:kern w:val="0"/>
+                <w:sz w:val="24"/>
+                <w:szCs w:val="24"/>
+                <w:lang w:eastAsia="en-IN"/>
+                <w14:ligatures w14:val="none"/>
+              </w:rPr>
+              <w:t>).</w:t>
+            </w:r>
+          </w:p>
+        </w:tc>
+      </w:tr>
+    </w:tbl>
+    <w:p>
+      <w:pPr>
+        <w:spacing w:before="100" w:beforeAutospacing="1" w:after="100" w:afterAutospacing="1" w:line="240" w:lineRule="auto"/>
+        <w:rPr>
+          <w:rFonts w:ascii="Times New Roman" w:eastAsia="Times New Roman" w:hAnsi="Times New Roman" w:cs="Times New Roman"/>
+          <w:vanish/>
+          <w:kern w:val="0"/>
+          <w:sz w:val="24"/>
+          <w:szCs w:val="24"/>
+          <w:lang w:eastAsia="en-IN"/>
+          <w14:ligatures w14:val="none"/>
+        </w:rPr>
+      </w:pPr>
+    </w:p>
+    <w:tbl>
+      <w:tblPr>
+        <w:tblpPr w:leftFromText="181" w:rightFromText="181" w:vertAnchor="text" w:horzAnchor="margin" w:tblpX="-714" w:tblpY="1"/>
+        <w:tblW w:w="10649" w:type="dxa"/>
+        <w:tblCellSpacing w:w="15" w:type="dxa"/>
+        <w:tblBorders>
+          <w:top w:val="single" w:sz="4" w:space="0" w:color="auto"/>
+          <w:left w:val="single" w:sz="4" w:space="0" w:color="auto"/>
+          <w:bottom w:val="single" w:sz="4" w:space="0" w:color="auto"/>
+          <w:right w:val="single" w:sz="4" w:space="0" w:color="auto"/>
+          <w:insideH w:val="single" w:sz="4" w:space="0" w:color="auto"/>
+          <w:insideV w:val="single" w:sz="4" w:space="0" w:color="auto"/>
+        </w:tblBorders>
+        <w:tblCellMar>
+          <w:top w:w="15" w:type="dxa"/>
+          <w:left w:w="15" w:type="dxa"/>
+          <w:bottom w:w="15" w:type="dxa"/>
+          <w:right w:w="15" w:type="dxa"/>
+        </w:tblCellMar>
+        <w:tblLook w:val="04A0" w:firstRow="1" w:lastRow="0" w:firstColumn="1" w:lastColumn="0" w:noHBand="0" w:noVBand="1"/>
+      </w:tblPr>
+      <w:tblGrid>
+        <w:gridCol w:w="1555"/>
+        <w:gridCol w:w="1254"/>
+        <w:gridCol w:w="7840"/>
+      </w:tblGrid>
+      <w:tr>
+        <w:trPr>
+          <w:trHeight w:val="859"/>
+          <w:tblHeader/>
+          <w:tblCellSpacing w:w="15" w:type="dxa"/>
+        </w:trPr>
+        <w:tc>
+          <w:tcPr>
+            <w:tcW w:w="1510" w:type="dxa"/>
+            <w:vAlign w:val="center"/>
+            <w:hideMark/>
+          </w:tcPr>
+          <w:p>
+            <w:pPr>
+              <w:spacing w:before="100" w:beforeAutospacing="1" w:after="100" w:afterAutospacing="1" w:line="240" w:lineRule="auto"/>
+              <w:rPr>
+                <w:rFonts w:ascii="Times New Roman" w:eastAsia="Times New Roman" w:hAnsi="Times New Roman" w:cs="Times New Roman"/>
+                <w:kern w:val="0"/>
+                <w:sz w:val="24"/>
+                <w:szCs w:val="24"/>
+                <w:lang w:eastAsia="en-IN"/>
+                <w14:ligatures w14:val="none"/>
+              </w:rPr>
+            </w:pPr>
+            <w:r>
+              <w:rPr>
+                <w:rFonts w:ascii="Times New Roman" w:eastAsia="Times New Roman" w:hAnsi="Times New Roman" w:cs="Times New Roman"/>
+                <w:b/>
+                <w:bCs/>
+                <w:kern w:val="0"/>
+                <w:sz w:val="24"/>
+                <w:szCs w:val="24"/>
+                <w:lang w:eastAsia="en-IN"/>
+                <w14:ligatures w14:val="none"/>
+              </w:rPr>
+              <w:lastRenderedPageBreak/>
+              <w:t>Metric</w:t>
+            </w:r>
+          </w:p>
+        </w:tc>
+        <w:tc>
+          <w:tcPr>
+            <w:tcW w:w="1224" w:type="dxa"/>
+            <w:vAlign w:val="center"/>
+            <w:hideMark/>
+          </w:tcPr>
+          <w:p>
+            <w:pPr>
+              <w:spacing w:before="100" w:beforeAutospacing="1" w:after="100" w:afterAutospacing="1" w:line="240" w:lineRule="auto"/>
+              <w:rPr>
+                <w:rFonts w:ascii="Times New Roman" w:eastAsia="Times New Roman" w:hAnsi="Times New Roman" w:cs="Times New Roman"/>
+                <w:kern w:val="0"/>
+                <w:sz w:val="24"/>
+                <w:szCs w:val="24"/>
+                <w:lang w:eastAsia="en-IN"/>
+                <w14:ligatures w14:val="none"/>
+              </w:rPr>
+            </w:pPr>
+            <w:r>
+              <w:rPr>
+                <w:rFonts w:ascii="Times New Roman" w:eastAsia="Times New Roman" w:hAnsi="Times New Roman" w:cs="Times New Roman"/>
+                <w:b/>
+                <w:bCs/>
+                <w:kern w:val="0"/>
+                <w:sz w:val="24"/>
+                <w:szCs w:val="24"/>
+                <w:lang w:eastAsia="en-IN"/>
+                <w14:ligatures w14:val="none"/>
+              </w:rPr>
+              <w:t>1D-CNN Result</w:t>
+            </w:r>
+          </w:p>
+        </w:tc>
+        <w:tc>
+          <w:tcPr>
+            <w:tcW w:w="0" w:type="auto"/>
+            <w:vAlign w:val="center"/>
+            <w:hideMark/>
+          </w:tcPr>
+          <w:p>
+            <w:pPr>
+              <w:spacing w:before="100" w:beforeAutospacing="1" w:after="100" w:afterAutospacing="1" w:line="240" w:lineRule="auto"/>
+              <w:rPr>
+                <w:rFonts w:ascii="Times New Roman" w:eastAsia="Times New Roman" w:hAnsi="Times New Roman" w:cs="Times New Roman"/>
+                <w:kern w:val="0"/>
+                <w:sz w:val="24"/>
+                <w:szCs w:val="24"/>
+                <w:lang w:eastAsia="en-IN"/>
+                <w14:ligatures w14:val="none"/>
+              </w:rPr>
+            </w:pPr>
+            <w:r>
+              <w:rPr>
+                <w:rFonts w:ascii="Times New Roman" w:eastAsia="Times New Roman" w:hAnsi="Times New Roman" w:cs="Times New Roman"/>
+                <w:b/>
+                <w:bCs/>
+                <w:kern w:val="0"/>
+                <w:sz w:val="24"/>
+                <w:szCs w:val="24"/>
+                <w:lang w:eastAsia="en-IN"/>
+                <w14:ligatures w14:val="none"/>
+              </w:rPr>
+              <w:t>Comparative Interpretation</w:t>
+            </w:r>
+          </w:p>
+        </w:tc>
+      </w:tr>
+      <w:tr>
+        <w:trPr>
+          <w:trHeight w:val="840"/>
+          <w:tblCellSpacing w:w="15" w:type="dxa"/>
+        </w:trPr>
+        <w:tc>
+          <w:tcPr>
+            <w:tcW w:w="1510" w:type="dxa"/>
+            <w:vAlign w:val="center"/>
+            <w:hideMark/>
+          </w:tcPr>
+          <w:p>
+            <w:pPr>
+              <w:spacing w:before="100" w:beforeAutospacing="1" w:after="100" w:afterAutospacing="1" w:line="240" w:lineRule="auto"/>
+              <w:rPr>
+                <w:rFonts w:ascii="Times New Roman" w:eastAsia="Times New Roman" w:hAnsi="Times New Roman" w:cs="Times New Roman"/>
+                <w:kern w:val="0"/>
+                <w:sz w:val="24"/>
+                <w:szCs w:val="24"/>
+                <w:lang w:eastAsia="en-IN"/>
+                <w14:ligatures w14:val="none"/>
+              </w:rPr>
+            </w:pPr>
+            <w:r>
+              <w:rPr>
+                <w:rFonts w:ascii="Times New Roman" w:eastAsia="Times New Roman" w:hAnsi="Times New Roman" w:cs="Times New Roman"/>
+                <w:b/>
+                <w:bCs/>
+                <w:kern w:val="0"/>
+                <w:sz w:val="24"/>
+                <w:szCs w:val="24"/>
+                <w:lang w:eastAsia="en-IN"/>
+                <w14:ligatures w14:val="none"/>
+              </w:rPr>
+              <w:t>MAE (kW)</w:t>
+            </w:r>
+          </w:p>
+        </w:tc>
+        <w:tc>
+          <w:tcPr>
+            <w:tcW w:w="1224" w:type="dxa"/>
+            <w:vAlign w:val="center"/>
+            <w:hideMark/>
+          </w:tcPr>
+          <w:p>
+            <w:pPr>
+              <w:spacing w:before="100" w:beforeAutospacing="1" w:after="100" w:afterAutospacing="1" w:line="240" w:lineRule="auto"/>
+              <w:rPr>
+                <w:rFonts w:ascii="Times New Roman" w:eastAsia="Times New Roman" w:hAnsi="Times New Roman" w:cs="Times New Roman"/>
+                <w:kern w:val="0"/>
+                <w:sz w:val="24"/>
+                <w:szCs w:val="24"/>
+                <w:lang w:eastAsia="en-IN"/>
+                <w14:ligatures w14:val="none"/>
+              </w:rPr>
+            </w:pPr>
+            <w:r>
+              <w:rPr>
+                <w:rFonts w:ascii="Times New Roman" w:eastAsia="Times New Roman" w:hAnsi="Times New Roman" w:cs="Times New Roman"/>
+                <w:b/>
+                <w:bCs/>
+                <w:kern w:val="0"/>
+                <w:sz w:val="24"/>
+                <w:szCs w:val="24"/>
+                <w:lang w:eastAsia="en-IN"/>
+                <w14:ligatures w14:val="none"/>
+              </w:rPr>
+              <w:t>541.03 kW</w:t>
+            </w:r>
+          </w:p>
+        </w:tc>
+        <w:tc>
+          <w:tcPr>
+            <w:tcW w:w="0" w:type="auto"/>
+            <w:vAlign w:val="center"/>
+            <w:hideMark/>
+          </w:tcPr>
+          <w:p>
+            <w:pPr>
+              <w:spacing w:before="100" w:beforeAutospacing="1" w:after="100" w:afterAutospacing="1" w:line="240" w:lineRule="auto"/>
+              <w:rPr>
+                <w:rFonts w:ascii="Times New Roman" w:eastAsia="Times New Roman" w:hAnsi="Times New Roman" w:cs="Times New Roman"/>
+                <w:kern w:val="0"/>
+                <w:sz w:val="24"/>
+                <w:szCs w:val="24"/>
+                <w:lang w:eastAsia="en-IN"/>
+                <w14:ligatures w14:val="none"/>
+              </w:rPr>
+            </w:pPr>
+            <w:r>
+              <w:rPr>
+                <w:rFonts w:ascii="Times New Roman" w:eastAsia="Times New Roman" w:hAnsi="Times New Roman" w:cs="Times New Roman"/>
+                <w:kern w:val="0"/>
+                <w:sz w:val="24"/>
+                <w:szCs w:val="24"/>
+                <w:lang w:eastAsia="en-IN"/>
+                <w14:ligatures w14:val="none"/>
+              </w:rPr>
+              <w:t xml:space="preserve">The </w:t>
+            </w:r>
+            <w:r>
+              <w:rPr>
+                <w:rFonts w:ascii="Times New Roman" w:eastAsia="Times New Roman" w:hAnsi="Times New Roman" w:cs="Times New Roman"/>
+                <w:b/>
+                <w:bCs/>
+                <w:kern w:val="0"/>
+                <w:sz w:val="24"/>
+                <w:szCs w:val="24"/>
+                <w:lang w:eastAsia="en-IN"/>
+                <w14:ligatures w14:val="none"/>
+              </w:rPr>
+              <w:t>lowest average error</w:t>
+            </w:r>
+            <w:r>
+              <w:rPr>
+                <w:rFonts w:ascii="Times New Roman" w:eastAsia="Times New Roman" w:hAnsi="Times New Roman" w:cs="Times New Roman"/>
+                <w:kern w:val="0"/>
+                <w:sz w:val="24"/>
+                <w:szCs w:val="24"/>
+                <w:lang w:eastAsia="en-IN"/>
+                <w14:ligatures w14:val="none"/>
+              </w:rPr>
+              <w:t xml:space="preserve"> of all models, indicating superior precision in typical forecasts.</w:t>
+            </w:r>
+          </w:p>
+        </w:tc>
+      </w:tr>
+      <w:tr>
+        <w:trPr>
+          <w:trHeight w:val="859"/>
+          <w:tblCellSpacing w:w="15" w:type="dxa"/>
+        </w:trPr>
+        <w:tc>
+          <w:tcPr>
+            <w:tcW w:w="1510" w:type="dxa"/>
+            <w:vAlign w:val="center"/>
+            <w:hideMark/>
+          </w:tcPr>
+          <w:p>
+            <w:pPr>
+              <w:spacing w:before="100" w:beforeAutospacing="1" w:after="100" w:afterAutospacing="1" w:line="240" w:lineRule="auto"/>
+              <w:rPr>
+                <w:rFonts w:ascii="Times New Roman" w:eastAsia="Times New Roman" w:hAnsi="Times New Roman" w:cs="Times New Roman"/>
+                <w:kern w:val="0"/>
+                <w:sz w:val="24"/>
+                <w:szCs w:val="24"/>
+                <w:lang w:eastAsia="en-IN"/>
+                <w14:ligatures w14:val="none"/>
+              </w:rPr>
+            </w:pPr>
+            <w:r>
+              <w:rPr>
+                <w:rFonts w:ascii="Times New Roman" w:eastAsia="Times New Roman" w:hAnsi="Times New Roman" w:cs="Times New Roman"/>
+                <w:b/>
+                <w:bCs/>
+                <w:kern w:val="0"/>
+                <w:sz w:val="24"/>
+                <w:szCs w:val="24"/>
+                <w:lang w:eastAsia="en-IN"/>
+                <w14:ligatures w14:val="none"/>
+              </w:rPr>
+              <w:t>RMSE (kW)</w:t>
+            </w:r>
+          </w:p>
+        </w:tc>
+        <w:tc>
+          <w:tcPr>
+            <w:tcW w:w="1224" w:type="dxa"/>
+            <w:vAlign w:val="center"/>
+            <w:hideMark/>
+          </w:tcPr>
+          <w:p>
+            <w:pPr>
+              <w:spacing w:before="100" w:beforeAutospacing="1" w:after="100" w:afterAutospacing="1" w:line="240" w:lineRule="auto"/>
+              <w:rPr>
+                <w:rFonts w:ascii="Times New Roman" w:eastAsia="Times New Roman" w:hAnsi="Times New Roman" w:cs="Times New Roman"/>
+                <w:kern w:val="0"/>
+                <w:sz w:val="24"/>
+                <w:szCs w:val="24"/>
+                <w:lang w:eastAsia="en-IN"/>
+                <w14:ligatures w14:val="none"/>
+              </w:rPr>
+            </w:pPr>
+            <w:r>
+              <w:rPr>
+                <w:rFonts w:ascii="Times New Roman" w:eastAsia="Times New Roman" w:hAnsi="Times New Roman" w:cs="Times New Roman"/>
+                <w:b/>
+                <w:bCs/>
+                <w:kern w:val="0"/>
+                <w:sz w:val="24"/>
+                <w:szCs w:val="24"/>
+                <w:lang w:eastAsia="en-IN"/>
+                <w14:ligatures w14:val="none"/>
+              </w:rPr>
+              <w:t>747.27 kW</w:t>
+            </w:r>
+          </w:p>
+        </w:tc>
+        <w:tc>
+          <w:tcPr>
+            <w:tcW w:w="0" w:type="auto"/>
+            <w:vAlign w:val="center"/>
+            <w:hideMark/>
+          </w:tcPr>
+          <w:p>
+            <w:pPr>
+              <w:spacing w:before="100" w:beforeAutospacing="1" w:after="100" w:afterAutospacing="1" w:line="240" w:lineRule="auto"/>
+              <w:rPr>
+                <w:rFonts w:ascii="Times New Roman" w:eastAsia="Times New Roman" w:hAnsi="Times New Roman" w:cs="Times New Roman"/>
+                <w:kern w:val="0"/>
+                <w:sz w:val="24"/>
+                <w:szCs w:val="24"/>
+                <w:lang w:eastAsia="en-IN"/>
+                <w14:ligatures w14:val="none"/>
+              </w:rPr>
+            </w:pPr>
+            <w:r>
+              <w:rPr>
+                <w:rFonts w:ascii="Times New Roman" w:eastAsia="Times New Roman" w:hAnsi="Times New Roman" w:cs="Times New Roman"/>
+                <w:kern w:val="0"/>
+                <w:sz w:val="24"/>
+                <w:szCs w:val="24"/>
+                <w:lang w:eastAsia="en-IN"/>
+                <w14:ligatures w14:val="none"/>
+              </w:rPr>
+              <w:t xml:space="preserve">The </w:t>
+            </w:r>
+            <w:r>
+              <w:rPr>
+                <w:rFonts w:ascii="Times New Roman" w:eastAsia="Times New Roman" w:hAnsi="Times New Roman" w:cs="Times New Roman"/>
+                <w:b/>
+                <w:bCs/>
+                <w:kern w:val="0"/>
+                <w:sz w:val="24"/>
+                <w:szCs w:val="24"/>
+                <w:lang w:eastAsia="en-IN"/>
+                <w14:ligatures w14:val="none"/>
+              </w:rPr>
+              <w:t>lowest RMSE</w:t>
+            </w:r>
+            <w:r>
+              <w:rPr>
+                <w:rFonts w:ascii="Times New Roman" w:eastAsia="Times New Roman" w:hAnsi="Times New Roman" w:cs="Times New Roman"/>
+                <w:kern w:val="0"/>
+                <w:sz w:val="24"/>
+                <w:szCs w:val="24"/>
+                <w:lang w:eastAsia="en-IN"/>
+                <w14:ligatures w14:val="none"/>
+              </w:rPr>
+              <w:t>, confirming the CNN handled large, unpredictable residual spikes significantly better than even the best boosting models.</w:t>
+            </w:r>
+          </w:p>
+        </w:tc>
+      </w:tr>
+      <w:tr>
+        <w:trPr>
+          <w:trHeight w:val="1700"/>
+          <w:tblCellSpacing w:w="15" w:type="dxa"/>
+        </w:trPr>
+        <w:tc>
+          <w:tcPr>
+            <w:tcW w:w="1510" w:type="dxa"/>
+            <w:vAlign w:val="center"/>
+            <w:hideMark/>
+          </w:tcPr>
+          <w:p>
+            <w:pPr>
+              <w:spacing w:before="100" w:beforeAutospacing="1" w:after="100" w:afterAutospacing="1" w:line="240" w:lineRule="auto"/>
+              <w:rPr>
+                <w:rFonts w:ascii="Times New Roman" w:eastAsia="Times New Roman" w:hAnsi="Times New Roman" w:cs="Times New Roman"/>
+                <w:kern w:val="0"/>
+                <w:sz w:val="24"/>
+                <w:szCs w:val="24"/>
+                <w:lang w:eastAsia="en-IN"/>
+                <w14:ligatures w14:val="none"/>
+              </w:rPr>
+            </w:pPr>
+            <w:proofErr w:type="spellStart"/>
+            <w:r>
+              <w:rPr>
+                <w:rFonts w:ascii="Times New Roman" w:eastAsia="Times New Roman" w:hAnsi="Times New Roman" w:cs="Times New Roman"/>
+                <w:b/>
+                <w:bCs/>
+                <w:kern w:val="0"/>
+                <w:sz w:val="24"/>
+                <w:szCs w:val="24"/>
+                <w:lang w:eastAsia="en-IN"/>
+                <w14:ligatures w14:val="none"/>
+              </w:rPr>
+              <w:t>sMAPE</w:t>
+            </w:r>
+            <w:proofErr w:type="spellEnd"/>
+            <w:r>
+              <w:rPr>
+                <w:rFonts w:ascii="Times New Roman" w:eastAsia="Times New Roman" w:hAnsi="Times New Roman" w:cs="Times New Roman"/>
+                <w:b/>
+                <w:bCs/>
+                <w:kern w:val="0"/>
+                <w:sz w:val="24"/>
+                <w:szCs w:val="24"/>
+                <w:lang w:eastAsia="en-IN"/>
+                <w14:ligatures w14:val="none"/>
+              </w:rPr>
+              <w:t xml:space="preserve"> (%)</w:t>
+            </w:r>
+          </w:p>
+        </w:tc>
+        <w:tc>
+          <w:tcPr>
+            <w:tcW w:w="1224" w:type="dxa"/>
+            <w:vAlign w:val="center"/>
+            <w:hideMark/>
+          </w:tcPr>
+          <w:p>
+            <w:pPr>
+              <w:spacing w:before="100" w:beforeAutospacing="1" w:after="100" w:afterAutospacing="1" w:line="240" w:lineRule="auto"/>
+              <w:rPr>
+                <w:rFonts w:ascii="Times New Roman" w:eastAsia="Times New Roman" w:hAnsi="Times New Roman" w:cs="Times New Roman"/>
+                <w:kern w:val="0"/>
+                <w:sz w:val="24"/>
+                <w:szCs w:val="24"/>
+                <w:lang w:eastAsia="en-IN"/>
+                <w14:ligatures w14:val="none"/>
+              </w:rPr>
+            </w:pPr>
+            <w:r>
+              <w:rPr>
+                <w:rFonts w:ascii="Times New Roman" w:eastAsia="Times New Roman" w:hAnsi="Times New Roman" w:cs="Times New Roman"/>
+                <w:b/>
+                <w:bCs/>
+                <w:kern w:val="0"/>
+                <w:sz w:val="24"/>
+                <w:szCs w:val="24"/>
+                <w:lang w:eastAsia="en-IN"/>
+                <w14:ligatures w14:val="none"/>
+              </w:rPr>
+              <w:t>1.04%</w:t>
+            </w:r>
+          </w:p>
+        </w:tc>
+        <w:tc>
+          <w:tcPr>
+            <w:tcW w:w="0" w:type="auto"/>
+            <w:vAlign w:val="center"/>
+            <w:hideMark/>
+          </w:tcPr>
+          <w:p>
+            <w:pPr>
+              <w:spacing w:before="100" w:beforeAutospacing="1" w:after="100" w:afterAutospacing="1" w:line="240" w:lineRule="auto"/>
+              <w:rPr>
+                <w:rFonts w:ascii="Times New Roman" w:eastAsia="Times New Roman" w:hAnsi="Times New Roman" w:cs="Times New Roman"/>
+                <w:kern w:val="0"/>
+                <w:sz w:val="24"/>
+                <w:szCs w:val="24"/>
+                <w:lang w:eastAsia="en-IN"/>
+                <w14:ligatures w14:val="none"/>
+              </w:rPr>
+            </w:pPr>
+            <w:r>
+              <w:rPr>
+                <w:rFonts w:ascii="Times New Roman" w:eastAsia="Times New Roman" w:hAnsi="Times New Roman" w:cs="Times New Roman"/>
+                <w:kern w:val="0"/>
+                <w:sz w:val="24"/>
+                <w:szCs w:val="24"/>
+                <w:lang w:eastAsia="en-IN"/>
+                <w14:ligatures w14:val="none"/>
+              </w:rPr>
+              <w:t xml:space="preserve">The </w:t>
+            </w:r>
+            <w:r>
+              <w:rPr>
+                <w:rFonts w:ascii="Times New Roman" w:eastAsia="Times New Roman" w:hAnsi="Times New Roman" w:cs="Times New Roman"/>
+                <w:b/>
+                <w:bCs/>
+                <w:kern w:val="0"/>
+                <w:sz w:val="24"/>
+                <w:szCs w:val="24"/>
+                <w:lang w:eastAsia="en-IN"/>
+                <w14:ligatures w14:val="none"/>
+              </w:rPr>
+              <w:t>best overall accuracy</w:t>
+            </w:r>
+            <w:r>
+              <w:rPr>
+                <w:rFonts w:ascii="Times New Roman" w:eastAsia="Times New Roman" w:hAnsi="Times New Roman" w:cs="Times New Roman"/>
+                <w:kern w:val="0"/>
+                <w:sz w:val="24"/>
+                <w:szCs w:val="24"/>
+                <w:lang w:eastAsia="en-IN"/>
+                <w14:ligatures w14:val="none"/>
+              </w:rPr>
+              <w:t xml:space="preserve">. An </w:t>
+            </w:r>
+            <w:proofErr w:type="spellStart"/>
+            <w:r>
+              <w:rPr>
+                <w:rFonts w:ascii="Times New Roman" w:eastAsia="Times New Roman" w:hAnsi="Times New Roman" w:cs="Times New Roman"/>
+                <w:kern w:val="0"/>
+                <w:sz w:val="24"/>
+                <w:szCs w:val="24"/>
+                <w:lang w:eastAsia="en-IN"/>
+                <w14:ligatures w14:val="none"/>
+              </w:rPr>
+              <w:t>sMAPE</w:t>
+            </w:r>
+            <w:proofErr w:type="spellEnd"/>
+            <w:r>
+              <w:rPr>
+                <w:rFonts w:ascii="Times New Roman" w:eastAsia="Times New Roman" w:hAnsi="Times New Roman" w:cs="Times New Roman"/>
+                <w:kern w:val="0"/>
+                <w:sz w:val="24"/>
+                <w:szCs w:val="24"/>
+                <w:lang w:eastAsia="en-IN"/>
+                <w14:ligatures w14:val="none"/>
+              </w:rPr>
+              <w:t xml:space="preserve"> near 1% represents exceptional, state-of-the-art performance for this high-frequency load forecasting task, definitively outperforming the 1.85% </w:t>
+            </w:r>
+            <w:proofErr w:type="spellStart"/>
+            <w:r>
+              <w:rPr>
+                <w:rFonts w:ascii="Times New Roman" w:eastAsia="Times New Roman" w:hAnsi="Times New Roman" w:cs="Times New Roman"/>
+                <w:kern w:val="0"/>
+                <w:sz w:val="24"/>
+                <w:szCs w:val="24"/>
+                <w:lang w:eastAsia="en-IN"/>
+                <w14:ligatures w14:val="none"/>
+              </w:rPr>
+              <w:t>sMAPE</w:t>
+            </w:r>
+            <w:proofErr w:type="spellEnd"/>
+            <w:r>
+              <w:rPr>
+                <w:rFonts w:ascii="Times New Roman" w:eastAsia="Times New Roman" w:hAnsi="Times New Roman" w:cs="Times New Roman"/>
+                <w:kern w:val="0"/>
+                <w:sz w:val="24"/>
+                <w:szCs w:val="24"/>
+                <w:lang w:eastAsia="en-IN"/>
+                <w14:ligatures w14:val="none"/>
+              </w:rPr>
+              <w:t xml:space="preserve"> of the </w:t>
+            </w:r>
+            <w:proofErr w:type="spellStart"/>
+            <w:r>
+              <w:rPr>
+                <w:rFonts w:ascii="Times New Roman" w:eastAsia="Times New Roman" w:hAnsi="Times New Roman" w:cs="Times New Roman"/>
+                <w:kern w:val="0"/>
+                <w:sz w:val="24"/>
+                <w:szCs w:val="24"/>
+                <w:lang w:eastAsia="en-IN"/>
+                <w14:ligatures w14:val="none"/>
+              </w:rPr>
+              <w:t>LightGBM</w:t>
+            </w:r>
+            <w:proofErr w:type="spellEnd"/>
+            <w:r>
+              <w:rPr>
+                <w:rFonts w:ascii="Times New Roman" w:eastAsia="Times New Roman" w:hAnsi="Times New Roman" w:cs="Times New Roman"/>
+                <w:kern w:val="0"/>
+                <w:sz w:val="24"/>
+                <w:szCs w:val="24"/>
+                <w:lang w:eastAsia="en-IN"/>
+                <w14:ligatures w14:val="none"/>
+              </w:rPr>
+              <w:t xml:space="preserve"> hybrid.</w:t>
+            </w:r>
+          </w:p>
+        </w:tc>
+      </w:tr>
+    </w:tbl>
+    <w:p>
+      <w:pPr>
+        <w:spacing w:before="100" w:beforeAutospacing="1" w:after="100" w:afterAutospacing="1" w:line="240" w:lineRule="auto"/>
+        <w:rPr>
+          <w:rFonts w:ascii="Times New Roman" w:eastAsia="Times New Roman" w:hAnsi="Times New Roman" w:cs="Times New Roman"/>
+          <w:b/>
+          <w:bCs/>
+          <w:kern w:val="0"/>
+          <w:sz w:val="24"/>
+          <w:szCs w:val="24"/>
+          <w:lang w:eastAsia="en-IN"/>
+          <w14:ligatures w14:val="none"/>
+        </w:rPr>
+      </w:pPr>
+    </w:p>
+    <w:p>
+      <w:pPr>
+        <w:spacing w:before="100" w:beforeAutospacing="1" w:after="100" w:afterAutospacing="1" w:line="240" w:lineRule="auto"/>
+        <w:rPr>
+          <w:rFonts w:ascii="Times New Roman" w:eastAsia="Times New Roman" w:hAnsi="Times New Roman" w:cs="Times New Roman"/>
+          <w:b/>
+          <w:bCs/>
+          <w:kern w:val="0"/>
+          <w:sz w:val="24"/>
+          <w:szCs w:val="24"/>
+          <w:lang w:eastAsia="en-IN"/>
+          <w14:ligatures w14:val="none"/>
+        </w:rPr>
+      </w:pPr>
+      <w:r>
+        <w:rPr>
+          <w:rFonts w:ascii="Times New Roman" w:eastAsia="Times New Roman" w:hAnsi="Times New Roman" w:cs="Times New Roman"/>
+          <w:b/>
+          <w:bCs/>
+          <w:kern w:val="0"/>
+          <w:sz w:val="24"/>
+          <w:szCs w:val="24"/>
+          <w:lang w:eastAsia="en-IN"/>
+          <w14:ligatures w14:val="none"/>
+        </w:rPr>
+        <w:t>Final Comparative Conclusion</w:t>
+      </w:r>
+    </w:p>
+    <w:p>
+      <w:pPr>
+        <w:spacing w:before="100" w:beforeAutospacing="1" w:after="100" w:afterAutospacing="1" w:line="240" w:lineRule="auto"/>
+        <w:rPr>
+          <w:rFonts w:ascii="Times New Roman" w:eastAsia="Times New Roman" w:hAnsi="Times New Roman" w:cs="Times New Roman"/>
+          <w:kern w:val="0"/>
+          <w:sz w:val="24"/>
+          <w:szCs w:val="24"/>
+          <w:lang w:eastAsia="en-IN"/>
+          <w14:ligatures w14:val="none"/>
+        </w:rPr>
+      </w:pPr>
+      <w:r>
+        <w:rPr>
+          <w:rFonts w:ascii="Times New Roman" w:eastAsia="Times New Roman" w:hAnsi="Times New Roman" w:cs="Times New Roman"/>
+          <w:kern w:val="0"/>
+          <w:sz w:val="24"/>
+          <w:szCs w:val="24"/>
+          <w:lang w:eastAsia="en-IN"/>
+          <w14:ligatures w14:val="none"/>
+        </w:rPr>
+        <w:t xml:space="preserve">The </w:t>
+      </w:r>
+      <w:r>
+        <w:rPr>
+          <w:rFonts w:ascii="Times New Roman" w:eastAsia="Times New Roman" w:hAnsi="Times New Roman" w:cs="Times New Roman"/>
+          <w:b/>
+          <w:bCs/>
+          <w:kern w:val="0"/>
+          <w:sz w:val="24"/>
+          <w:szCs w:val="24"/>
+          <w:lang w:eastAsia="en-IN"/>
+          <w14:ligatures w14:val="none"/>
+        </w:rPr>
+        <w:t>STL + 1D-CNN</w:t>
+      </w:r>
+      <w:r>
+        <w:rPr>
+          <w:rFonts w:ascii="Times New Roman" w:eastAsia="Times New Roman" w:hAnsi="Times New Roman" w:cs="Times New Roman"/>
+          <w:kern w:val="0"/>
+          <w:sz w:val="24"/>
+          <w:szCs w:val="24"/>
+          <w:lang w:eastAsia="en-IN"/>
+          <w14:ligatures w14:val="none"/>
+        </w:rPr>
+        <w:t xml:space="preserve"> model is unequivocally the </w:t>
+      </w:r>
+      <w:r>
+        <w:rPr>
+          <w:rFonts w:ascii="Times New Roman" w:eastAsia="Times New Roman" w:hAnsi="Times New Roman" w:cs="Times New Roman"/>
+          <w:b/>
+          <w:bCs/>
+          <w:kern w:val="0"/>
+          <w:sz w:val="24"/>
+          <w:szCs w:val="24"/>
+          <w:lang w:eastAsia="en-IN"/>
+          <w14:ligatures w14:val="none"/>
+        </w:rPr>
+        <w:t>best-performing model</w:t>
+      </w:r>
+      <w:r>
+        <w:rPr>
+          <w:rFonts w:ascii="Times New Roman" w:eastAsia="Times New Roman" w:hAnsi="Times New Roman" w:cs="Times New Roman"/>
+          <w:kern w:val="0"/>
+          <w:sz w:val="24"/>
+          <w:szCs w:val="24"/>
+          <w:lang w:eastAsia="en-IN"/>
+          <w14:ligatures w14:val="none"/>
+        </w:rPr>
+        <w:t xml:space="preserve"> developed in this research, demonstrating the power of Deep Learning architectures, when correctly configured with GPU acceleration, to capture complex temporal dependencies in the residual component of the load series more effectively than traditional Machine Learning or Classical statistical methods.</w:t>
+      </w:r>
     </w:p>
     <w:p>
       <w:pPr>

</xml_diff>